<commit_message>
Add center camera, video mixer and 자막기 to the AV setup checklist
- Video flow now runs camera/laptop → our video mixer → 자막기 → splitter
  → projector and pulpit monitor TV, with the mixer multiview on an
  operator monitor; the HDMI switcher is dropped.
- New mixer input plan, camera/tripod/power/operator-monitor items, a 5m
  HDMI run for the camera, and mini/micro HDMI adapters.
- New section 4 with camera placement, format and exposure settings and
  rehearsal checks; venue checklist asks about the aisle tripod spot.
- Added or changed rows are highlighted yellow.

Co-Authored-By: Claude Opus 5.5 <noreply@anthropic.com>
Claude-Session: https://claude.ai/code/session_01BrkfjrBnqu83xestg1tm1p
</commit_message>
<xml_diff>
--- a/남부연합_성경세미나_방송세팅_준비물.docx
+++ b/남부연합_성경세미나_방송세팅_준비물.docx
@@ -20,7 +20,7 @@
     </w:p>
     <w:p>
       <w:pPr>
-        <w:spacing w:after="200" w:before="0" w:line="260"/>
+        <w:spacing w:after="60" w:before="0" w:line="260"/>
         <w:jc w:val="center"/>
       </w:pPr>
       <w:r>
@@ -31,6 +31,22 @@
           <w:szCs w:val="21"/>
         </w:rPr>
         <w:t xml:space="preserve">2026. 10. 18(일)  ·  부산 벡스코 오디토리움</w:t>
+      </w:r>
+    </w:p>
+    <w:p>
+      <w:pPr>
+        <w:shd w:fill="FFF2CC" w:color="auto" w:val="clear"/>
+        <w:spacing w:after="160" w:before="0"/>
+        <w:jc w:val="center"/>
+      </w:pPr>
+      <w:r>
+        <w:rPr>
+          <w:rFonts w:ascii="맑은 고딕" w:cs="맑은 고딕" w:eastAsia="맑은 고딕" w:hAnsi="맑은 고딕"/>
+          <w:color w:val="595959"/>
+          <w:sz w:val="17"/>
+          <w:szCs w:val="17"/>
+        </w:rPr>
+        <w:t xml:space="preserve">노란 줄 = 추가·변경된 항목 (무선 마이크, 중앙 카메라 · 영상 믹서 · 자막기)</w:t>
       </w:r>
     </w:p>
     <w:p>
@@ -153,6 +169,52 @@
       <w:r>
         <w:rPr>
           <w:rFonts w:ascii="맑은 고딕" w:cs="맑은 고딕" w:eastAsia="맑은 고딕" w:hAnsi="맑은 고딕"/>
+          <w:b/>
+          <w:bCs/>
+          <w:sz w:val="19"/>
+          <w:szCs w:val="19"/>
+        </w:rPr>
+        <w:t xml:space="preserve">영상 믹서 · 자막기</w:t>
+      </w:r>
+      <w:r>
+        <w:rPr>
+          <w:rFonts w:ascii="맑은 고딕" w:cs="맑은 고딕" w:eastAsia="맑은 고딕" w:hAnsi="맑은 고딕"/>
+          <w:sz w:val="19"/>
+          <w:szCs w:val="19"/>
+        </w:rPr>
+        <w:t xml:space="preserve">는 우리 장비를 쓰고, </w:t>
+      </w:r>
+      <w:r>
+        <w:rPr>
+          <w:rFonts w:ascii="맑은 고딕" w:cs="맑은 고딕" w:eastAsia="맑은 고딕" w:hAnsi="맑은 고딕"/>
+          <w:b/>
+          <w:bCs/>
+          <w:sz w:val="19"/>
+          <w:szCs w:val="19"/>
+        </w:rPr>
+        <w:t xml:space="preserve">중앙 카메라</w:t>
+      </w:r>
+      <w:r>
+        <w:rPr>
+          <w:rFonts w:ascii="맑은 고딕" w:cs="맑은 고딕" w:eastAsia="맑은 고딕" w:hAnsi="맑은 고딕"/>
+          <w:sz w:val="19"/>
+          <w:szCs w:val="19"/>
+        </w:rPr>
+        <w:t xml:space="preserve">는 객석 가운데 뒤쪽 영상 믹서 바로 옆에 둡니다.</w:t>
+      </w:r>
+    </w:p>
+    <w:p>
+      <w:pPr>
+        <w:pStyle w:val="ListParagraph"/>
+        <w:numPr>
+          <w:ilvl w:val="0"/>
+          <w:numId w:val="2"/>
+        </w:numPr>
+        <w:spacing w:after="40" w:before="0" w:line="270"/>
+      </w:pPr>
+      <w:r>
+        <w:rPr>
+          <w:rFonts w:ascii="맑은 고딕" w:cs="맑은 고딕" w:eastAsia="맑은 고딕" w:hAnsi="맑은 고딕"/>
           <w:sz w:val="19"/>
           <w:szCs w:val="19"/>
         </w:rPr>
@@ -243,7 +305,7 @@
     </w:p>
     <w:p>
       <w:pPr>
-        <w:spacing w:after="120" w:before="0" w:line="260"/>
+        <w:spacing w:after="50" w:before="0" w:line="260"/>
       </w:pPr>
       <w:r>
         <w:rPr>
@@ -261,12 +323,35 @@
           <w:sz w:val="19"/>
           <w:szCs w:val="19"/>
         </w:rPr>
-        <w:t xml:space="preserve">영상 노트북 · 자막 노트북 → HDMI 스위처 → (자막기) → HDMI 분배기 → ① 빔프로젝터  ② HDMI 연장기 ─ 랜선 50m ─ 모니터 TV</w:t>
+        <w:t xml:space="preserve">중앙 카메라 · 영상 노트북 (· 자막 PC) → 영상 믹서 → 자막기 → HDMI 분배기 → ① 빔프로젝터  ② HDMI 연장기 ─ 랜선 50m ─ 강대상 앞 모니터 TV</w:t>
       </w:r>
     </w:p>
     <w:p>
       <w:pPr>
-        <w:spacing w:after="60" w:before="0" w:line="260"/>
+        <w:spacing w:after="120" w:before="0" w:line="260"/>
+      </w:pPr>
+      <w:r>
+        <w:rPr>
+          <w:rFonts w:ascii="맑은 고딕" w:cs="맑은 고딕" w:eastAsia="맑은 고딕" w:hAnsi="맑은 고딕"/>
+          <w:b/>
+          <w:bCs/>
+          <w:sz w:val="19"/>
+          <w:szCs w:val="19"/>
+        </w:rPr>
+        <w:t xml:space="preserve">         </w:t>
+      </w:r>
+      <w:r>
+        <w:rPr>
+          <w:rFonts w:ascii="맑은 고딕" w:cs="맑은 고딕" w:eastAsia="맑은 고딕" w:hAnsi="맑은 고딕"/>
+          <w:sz w:val="19"/>
+          <w:szCs w:val="19"/>
+        </w:rPr>
+        <w:t xml:space="preserve">영상 믹서 멀티뷰 출력 → 운영자용 모니터</w:t>
+      </w:r>
+    </w:p>
+    <w:p>
+      <w:pPr>
+        <w:spacing w:after="50" w:before="0" w:line="260"/>
       </w:pPr>
       <w:r>
         <w:rPr>
@@ -276,7 +361,7 @@
           <w:sz w:val="20"/>
           <w:szCs w:val="20"/>
         </w:rPr>
-        <w:t xml:space="preserve">콘솔 채널 배정</w:t>
+        <w:t xml:space="preserve">콘솔 채널 배정 (음향)</w:t>
       </w:r>
     </w:p>
     <w:tbl>
@@ -695,7 +780,7 @@
                 <w:sz w:val="19"/>
                 <w:szCs w:val="19"/>
               </w:rPr>
-              <w:t xml:space="preserve">무선 마이크 1~2 (추가)</w:t>
+              <w:t xml:space="preserve">무선 마이크 1~2</w:t>
             </w:r>
           </w:p>
         </w:tc>
@@ -969,7 +1054,7 @@
                 <w:sz w:val="19"/>
                 <w:szCs w:val="19"/>
               </w:rPr>
-              <w:t xml:space="preserve">자막 노트북 소리·여분 마이크</w:t>
+              <w:t xml:space="preserve">자막 PC 소리·여분 마이크</w:t>
             </w:r>
           </w:p>
         </w:tc>
@@ -987,6 +1072,642 @@
           <w:szCs w:val="17"/>
         </w:rPr>
         <w:t xml:space="preserve">※ CH 1~6은 마이크 입력(XLR + 팬텀)이어야 합니다. 우리 콘솔의 마이크 입력이 6개보다 적으면 미리 알려 주세요.</w:t>
+      </w:r>
+    </w:p>
+    <w:p>
+      <w:pPr>
+        <w:spacing w:after="60" w:before="0" w:line="260"/>
+      </w:pPr>
+      <w:r>
+        <w:rPr>
+          <w:rFonts w:ascii="맑은 고딕" w:cs="맑은 고딕" w:eastAsia="맑은 고딕" w:hAnsi="맑은 고딕"/>
+          <w:sz w:val="19"/>
+          <w:szCs w:val="19"/>
+        </w:rPr>
+        <w:t xml:space="preserve"/>
+      </w:r>
+    </w:p>
+    <w:p>
+      <w:pPr>
+        <w:spacing w:after="50" w:before="0" w:line="260"/>
+      </w:pPr>
+      <w:r>
+        <w:rPr>
+          <w:rFonts w:ascii="맑은 고딕" w:cs="맑은 고딕" w:eastAsia="맑은 고딕" w:hAnsi="맑은 고딕"/>
+          <w:b/>
+          <w:bCs/>
+          <w:sz w:val="20"/>
+          <w:szCs w:val="20"/>
+        </w:rPr>
+        <w:t xml:space="preserve">영상 믹서 입력 배정</w:t>
+      </w:r>
+    </w:p>
+    <w:tbl>
+      <w:tblPr>
+        <w:tblW w:type="dxa" w:w="10206"/>
+        <w:tblBorders>
+          <w:top w:val="single" w:color="808080" w:sz="4"/>
+          <w:left w:val="single" w:color="808080" w:sz="4"/>
+          <w:bottom w:val="single" w:color="808080" w:sz="4"/>
+          <w:right w:val="single" w:color="808080" w:sz="4"/>
+          <w:insideH w:val="single" w:color="808080" w:sz="4"/>
+          <w:insideV w:val="single" w:color="808080" w:sz="4"/>
+        </w:tblBorders>
+      </w:tblPr>
+      <w:tblGrid>
+        <w:gridCol w:w="1100"/>
+        <w:gridCol w:w="2900"/>
+        <w:gridCol w:w="3300"/>
+        <w:gridCol w:w="2906"/>
+      </w:tblGrid>
+      <w:tr>
+        <w:trPr>
+          <w:cantSplit/>
+          <w:tblHeader/>
+          <w:trHeight w:val="340" w:hRule="atLeast"/>
+        </w:trPr>
+        <w:tc>
+          <w:tcPr>
+            <w:tcW w:type="dxa" w:w="1100"/>
+            <w:shd w:fill="DDEBF7" w:color="auto" w:val="clear"/>
+            <w:tcMar>
+              <w:top w:type="dxa" w:w="30"/>
+              <w:left w:type="dxa" w:w="100"/>
+              <w:bottom w:type="dxa" w:w="30"/>
+              <w:right w:type="dxa" w:w="100"/>
+            </w:tcMar>
+            <w:vAlign w:val="center"/>
+          </w:tcPr>
+          <w:p>
+            <w:pPr>
+              <w:spacing w:after="0" w:before="0" w:line="240"/>
+              <w:jc w:val="center"/>
+            </w:pPr>
+            <w:r>
+              <w:rPr>
+                <w:rFonts w:ascii="맑은 고딕" w:cs="맑은 고딕" w:eastAsia="맑은 고딕" w:hAnsi="맑은 고딕"/>
+                <w:b/>
+                <w:bCs/>
+                <w:sz w:val="19"/>
+                <w:szCs w:val="19"/>
+              </w:rPr>
+              <w:t xml:space="preserve">입력</w:t>
+            </w:r>
+          </w:p>
+        </w:tc>
+        <w:tc>
+          <w:tcPr>
+            <w:tcW w:type="dxa" w:w="2900"/>
+            <w:shd w:fill="DDEBF7" w:color="auto" w:val="clear"/>
+            <w:tcMar>
+              <w:top w:type="dxa" w:w="30"/>
+              <w:left w:type="dxa" w:w="100"/>
+              <w:bottom w:type="dxa" w:w="30"/>
+              <w:right w:type="dxa" w:w="100"/>
+            </w:tcMar>
+            <w:vAlign w:val="center"/>
+          </w:tcPr>
+          <w:p>
+            <w:pPr>
+              <w:spacing w:after="0" w:before="0" w:line="240"/>
+              <w:jc w:val="center"/>
+            </w:pPr>
+            <w:r>
+              <w:rPr>
+                <w:rFonts w:ascii="맑은 고딕" w:cs="맑은 고딕" w:eastAsia="맑은 고딕" w:hAnsi="맑은 고딕"/>
+                <w:b/>
+                <w:bCs/>
+                <w:sz w:val="19"/>
+                <w:szCs w:val="19"/>
+              </w:rPr>
+              <w:t xml:space="preserve">소스</w:t>
+            </w:r>
+          </w:p>
+        </w:tc>
+        <w:tc>
+          <w:tcPr>
+            <w:tcW w:type="dxa" w:w="3300"/>
+            <w:shd w:fill="DDEBF7" w:color="auto" w:val="clear"/>
+            <w:tcMar>
+              <w:top w:type="dxa" w:w="30"/>
+              <w:left w:type="dxa" w:w="100"/>
+              <w:bottom w:type="dxa" w:w="30"/>
+              <w:right w:type="dxa" w:w="100"/>
+            </w:tcMar>
+            <w:vAlign w:val="center"/>
+          </w:tcPr>
+          <w:p>
+            <w:pPr>
+              <w:spacing w:after="0" w:before="0" w:line="240"/>
+              <w:jc w:val="center"/>
+            </w:pPr>
+            <w:r>
+              <w:rPr>
+                <w:rFonts w:ascii="맑은 고딕" w:cs="맑은 고딕" w:eastAsia="맑은 고딕" w:hAnsi="맑은 고딕"/>
+                <w:b/>
+                <w:bCs/>
+                <w:sz w:val="19"/>
+                <w:szCs w:val="19"/>
+              </w:rPr>
+              <w:t xml:space="preserve">연결</w:t>
+            </w:r>
+          </w:p>
+        </w:tc>
+        <w:tc>
+          <w:tcPr>
+            <w:tcW w:type="dxa" w:w="2906"/>
+            <w:shd w:fill="DDEBF7" w:color="auto" w:val="clear"/>
+            <w:tcMar>
+              <w:top w:type="dxa" w:w="30"/>
+              <w:left w:type="dxa" w:w="100"/>
+              <w:bottom w:type="dxa" w:w="30"/>
+              <w:right w:type="dxa" w:w="100"/>
+            </w:tcMar>
+            <w:vAlign w:val="center"/>
+          </w:tcPr>
+          <w:p>
+            <w:pPr>
+              <w:spacing w:after="0" w:before="0" w:line="240"/>
+              <w:jc w:val="center"/>
+            </w:pPr>
+            <w:r>
+              <w:rPr>
+                <w:rFonts w:ascii="맑은 고딕" w:cs="맑은 고딕" w:eastAsia="맑은 고딕" w:hAnsi="맑은 고딕"/>
+                <w:b/>
+                <w:bCs/>
+                <w:sz w:val="19"/>
+                <w:szCs w:val="19"/>
+              </w:rPr>
+              <w:t xml:space="preserve">비고</w:t>
+            </w:r>
+          </w:p>
+        </w:tc>
+      </w:tr>
+      <w:tr>
+        <w:trPr>
+          <w:cantSplit/>
+          <w:trHeight w:val="280" w:hRule="atLeast"/>
+        </w:trPr>
+        <w:tc>
+          <w:tcPr>
+            <w:tcW w:type="dxa" w:w="1100"/>
+            <w:shd w:fill="FFF2CC" w:color="auto" w:val="clear"/>
+            <w:tcMar>
+              <w:top w:type="dxa" w:w="30"/>
+              <w:left w:type="dxa" w:w="100"/>
+              <w:bottom w:type="dxa" w:w="30"/>
+              <w:right w:type="dxa" w:w="100"/>
+            </w:tcMar>
+            <w:vAlign w:val="center"/>
+          </w:tcPr>
+          <w:p>
+            <w:pPr>
+              <w:spacing w:after="0" w:before="0" w:line="240"/>
+              <w:jc w:val="center"/>
+            </w:pPr>
+            <w:r>
+              <w:rPr>
+                <w:rFonts w:ascii="맑은 고딕" w:cs="맑은 고딕" w:eastAsia="맑은 고딕" w:hAnsi="맑은 고딕"/>
+                <w:sz w:val="19"/>
+                <w:szCs w:val="19"/>
+              </w:rPr>
+              <w:t xml:space="preserve">1</w:t>
+            </w:r>
+          </w:p>
+        </w:tc>
+        <w:tc>
+          <w:tcPr>
+            <w:tcW w:type="dxa" w:w="2900"/>
+            <w:shd w:fill="FFF2CC" w:color="auto" w:val="clear"/>
+            <w:tcMar>
+              <w:top w:type="dxa" w:w="30"/>
+              <w:left w:type="dxa" w:w="100"/>
+              <w:bottom w:type="dxa" w:w="30"/>
+              <w:right w:type="dxa" w:w="100"/>
+            </w:tcMar>
+            <w:vAlign w:val="center"/>
+          </w:tcPr>
+          <w:p>
+            <w:pPr>
+              <w:spacing w:after="0" w:before="0" w:line="240"/>
+              <w:jc w:val="left"/>
+            </w:pPr>
+            <w:r>
+              <w:rPr>
+                <w:rFonts w:ascii="맑은 고딕" w:cs="맑은 고딕" w:eastAsia="맑은 고딕" w:hAnsi="맑은 고딕"/>
+                <w:sz w:val="19"/>
+                <w:szCs w:val="19"/>
+              </w:rPr>
+              <w:t xml:space="preserve">중앙 카메라</w:t>
+            </w:r>
+          </w:p>
+        </w:tc>
+        <w:tc>
+          <w:tcPr>
+            <w:tcW w:type="dxa" w:w="3300"/>
+            <w:shd w:fill="FFF2CC" w:color="auto" w:val="clear"/>
+            <w:tcMar>
+              <w:top w:type="dxa" w:w="30"/>
+              <w:left w:type="dxa" w:w="100"/>
+              <w:bottom w:type="dxa" w:w="30"/>
+              <w:right w:type="dxa" w:w="100"/>
+            </w:tcMar>
+            <w:vAlign w:val="center"/>
+          </w:tcPr>
+          <w:p>
+            <w:pPr>
+              <w:spacing w:after="0" w:before="0" w:line="240"/>
+              <w:jc w:val="left"/>
+            </w:pPr>
+            <w:r>
+              <w:rPr>
+                <w:rFonts w:ascii="맑은 고딕" w:cs="맑은 고딕" w:eastAsia="맑은 고딕" w:hAnsi="맑은 고딕"/>
+                <w:sz w:val="19"/>
+                <w:szCs w:val="19"/>
+              </w:rPr>
+              <w:t xml:space="preserve">HDMI 5m</w:t>
+            </w:r>
+          </w:p>
+        </w:tc>
+        <w:tc>
+          <w:tcPr>
+            <w:tcW w:type="dxa" w:w="2906"/>
+            <w:shd w:fill="FFF2CC" w:color="auto" w:val="clear"/>
+            <w:tcMar>
+              <w:top w:type="dxa" w:w="30"/>
+              <w:left w:type="dxa" w:w="100"/>
+              <w:bottom w:type="dxa" w:w="30"/>
+              <w:right w:type="dxa" w:w="100"/>
+            </w:tcMar>
+            <w:vAlign w:val="center"/>
+          </w:tcPr>
+          <w:p>
+            <w:pPr>
+              <w:spacing w:after="0" w:before="0" w:line="240"/>
+              <w:jc w:val="left"/>
+            </w:pPr>
+            <w:r>
+              <w:rPr>
+                <w:rFonts w:ascii="맑은 고딕" w:cs="맑은 고딕" w:eastAsia="맑은 고딕" w:hAnsi="맑은 고딕"/>
+                <w:sz w:val="19"/>
+                <w:szCs w:val="19"/>
+              </w:rPr>
+              <w:t xml:space="preserve">메인 화면 (강사·무대)</w:t>
+            </w:r>
+          </w:p>
+        </w:tc>
+      </w:tr>
+      <w:tr>
+        <w:trPr>
+          <w:cantSplit/>
+          <w:trHeight w:val="280" w:hRule="atLeast"/>
+        </w:trPr>
+        <w:tc>
+          <w:tcPr>
+            <w:tcW w:type="dxa" w:w="1100"/>
+            <w:shd w:fill="FFF2CC" w:color="auto" w:val="clear"/>
+            <w:tcMar>
+              <w:top w:type="dxa" w:w="30"/>
+              <w:left w:type="dxa" w:w="100"/>
+              <w:bottom w:type="dxa" w:w="30"/>
+              <w:right w:type="dxa" w:w="100"/>
+            </w:tcMar>
+            <w:vAlign w:val="center"/>
+          </w:tcPr>
+          <w:p>
+            <w:pPr>
+              <w:spacing w:after="0" w:before="0" w:line="240"/>
+              <w:jc w:val="center"/>
+            </w:pPr>
+            <w:r>
+              <w:rPr>
+                <w:rFonts w:ascii="맑은 고딕" w:cs="맑은 고딕" w:eastAsia="맑은 고딕" w:hAnsi="맑은 고딕"/>
+                <w:sz w:val="19"/>
+                <w:szCs w:val="19"/>
+              </w:rPr>
+              <w:t xml:space="preserve">2</w:t>
+            </w:r>
+          </w:p>
+        </w:tc>
+        <w:tc>
+          <w:tcPr>
+            <w:tcW w:type="dxa" w:w="2900"/>
+            <w:shd w:fill="FFF2CC" w:color="auto" w:val="clear"/>
+            <w:tcMar>
+              <w:top w:type="dxa" w:w="30"/>
+              <w:left w:type="dxa" w:w="100"/>
+              <w:bottom w:type="dxa" w:w="30"/>
+              <w:right w:type="dxa" w:w="100"/>
+            </w:tcMar>
+            <w:vAlign w:val="center"/>
+          </w:tcPr>
+          <w:p>
+            <w:pPr>
+              <w:spacing w:after="0" w:before="0" w:line="240"/>
+              <w:jc w:val="left"/>
+            </w:pPr>
+            <w:r>
+              <w:rPr>
+                <w:rFonts w:ascii="맑은 고딕" w:cs="맑은 고딕" w:eastAsia="맑은 고딕" w:hAnsi="맑은 고딕"/>
+                <w:sz w:val="19"/>
+                <w:szCs w:val="19"/>
+              </w:rPr>
+              <w:t xml:space="preserve">다른 카메라 (있으면)</w:t>
+            </w:r>
+          </w:p>
+        </w:tc>
+        <w:tc>
+          <w:tcPr>
+            <w:tcW w:type="dxa" w:w="3300"/>
+            <w:shd w:fill="FFF2CC" w:color="auto" w:val="clear"/>
+            <w:tcMar>
+              <w:top w:type="dxa" w:w="30"/>
+              <w:left w:type="dxa" w:w="100"/>
+              <w:bottom w:type="dxa" w:w="30"/>
+              <w:right w:type="dxa" w:w="100"/>
+            </w:tcMar>
+            <w:vAlign w:val="center"/>
+          </w:tcPr>
+          <w:p>
+            <w:pPr>
+              <w:spacing w:after="0" w:before="0" w:line="240"/>
+              <w:jc w:val="left"/>
+            </w:pPr>
+            <w:r>
+              <w:rPr>
+                <w:rFonts w:ascii="맑은 고딕" w:cs="맑은 고딕" w:eastAsia="맑은 고딕" w:hAnsi="맑은 고딕"/>
+                <w:sz w:val="19"/>
+                <w:szCs w:val="19"/>
+              </w:rPr>
+              <w:t xml:space="preserve">HDMI</w:t>
+            </w:r>
+          </w:p>
+        </w:tc>
+        <w:tc>
+          <w:tcPr>
+            <w:tcW w:type="dxa" w:w="2906"/>
+            <w:shd w:fill="FFF2CC" w:color="auto" w:val="clear"/>
+            <w:tcMar>
+              <w:top w:type="dxa" w:w="30"/>
+              <w:left w:type="dxa" w:w="100"/>
+              <w:bottom w:type="dxa" w:w="30"/>
+              <w:right w:type="dxa" w:w="100"/>
+            </w:tcMar>
+            <w:vAlign w:val="center"/>
+          </w:tcPr>
+          <w:p>
+            <w:pPr>
+              <w:spacing w:after="0" w:before="0" w:line="240"/>
+              <w:jc w:val="left"/>
+            </w:pPr>
+            <w:r>
+              <w:rPr>
+                <w:rFonts w:ascii="맑은 고딕" w:cs="맑은 고딕" w:eastAsia="맑은 고딕" w:hAnsi="맑은 고딕"/>
+                <w:sz w:val="19"/>
+                <w:szCs w:val="19"/>
+              </w:rPr>
+              <w:t xml:space="preserve">측면·합창단 화면</w:t>
+            </w:r>
+          </w:p>
+        </w:tc>
+      </w:tr>
+      <w:tr>
+        <w:trPr>
+          <w:cantSplit/>
+          <w:trHeight w:val="280" w:hRule="atLeast"/>
+        </w:trPr>
+        <w:tc>
+          <w:tcPr>
+            <w:tcW w:type="dxa" w:w="1100"/>
+            <w:tcMar>
+              <w:top w:type="dxa" w:w="30"/>
+              <w:left w:type="dxa" w:w="100"/>
+              <w:bottom w:type="dxa" w:w="30"/>
+              <w:right w:type="dxa" w:w="100"/>
+            </w:tcMar>
+            <w:vAlign w:val="center"/>
+          </w:tcPr>
+          <w:p>
+            <w:pPr>
+              <w:spacing w:after="0" w:before="0" w:line="240"/>
+              <w:jc w:val="center"/>
+            </w:pPr>
+            <w:r>
+              <w:rPr>
+                <w:rFonts w:ascii="맑은 고딕" w:cs="맑은 고딕" w:eastAsia="맑은 고딕" w:hAnsi="맑은 고딕"/>
+                <w:sz w:val="19"/>
+                <w:szCs w:val="19"/>
+              </w:rPr>
+              <w:t xml:space="preserve">3</w:t>
+            </w:r>
+          </w:p>
+        </w:tc>
+        <w:tc>
+          <w:tcPr>
+            <w:tcW w:type="dxa" w:w="2900"/>
+            <w:tcMar>
+              <w:top w:type="dxa" w:w="30"/>
+              <w:left w:type="dxa" w:w="100"/>
+              <w:bottom w:type="dxa" w:w="30"/>
+              <w:right w:type="dxa" w:w="100"/>
+            </w:tcMar>
+            <w:vAlign w:val="center"/>
+          </w:tcPr>
+          <w:p>
+            <w:pPr>
+              <w:spacing w:after="0" w:before="0" w:line="240"/>
+              <w:jc w:val="left"/>
+            </w:pPr>
+            <w:r>
+              <w:rPr>
+                <w:rFonts w:ascii="맑은 고딕" w:cs="맑은 고딕" w:eastAsia="맑은 고딕" w:hAnsi="맑은 고딕"/>
+                <w:sz w:val="19"/>
+                <w:szCs w:val="19"/>
+              </w:rPr>
+              <w:t xml:space="preserve">영상·사진 노트북</w:t>
+            </w:r>
+          </w:p>
+        </w:tc>
+        <w:tc>
+          <w:tcPr>
+            <w:tcW w:type="dxa" w:w="3300"/>
+            <w:tcMar>
+              <w:top w:type="dxa" w:w="30"/>
+              <w:left w:type="dxa" w:w="100"/>
+              <w:bottom w:type="dxa" w:w="30"/>
+              <w:right w:type="dxa" w:w="100"/>
+            </w:tcMar>
+            <w:vAlign w:val="center"/>
+          </w:tcPr>
+          <w:p>
+            <w:pPr>
+              <w:spacing w:after="0" w:before="0" w:line="240"/>
+              <w:jc w:val="left"/>
+            </w:pPr>
+            <w:r>
+              <w:rPr>
+                <w:rFonts w:ascii="맑은 고딕" w:cs="맑은 고딕" w:eastAsia="맑은 고딕" w:hAnsi="맑은 고딕"/>
+                <w:sz w:val="19"/>
+                <w:szCs w:val="19"/>
+              </w:rPr>
+              <w:t xml:space="preserve">HDMI 2m</w:t>
+            </w:r>
+          </w:p>
+        </w:tc>
+        <w:tc>
+          <w:tcPr>
+            <w:tcW w:type="dxa" w:w="2906"/>
+            <w:tcMar>
+              <w:top w:type="dxa" w:w="30"/>
+              <w:left w:type="dxa" w:w="100"/>
+              <w:bottom w:type="dxa" w:w="30"/>
+              <w:right w:type="dxa" w:w="100"/>
+            </w:tcMar>
+            <w:vAlign w:val="center"/>
+          </w:tcPr>
+          <w:p>
+            <w:pPr>
+              <w:spacing w:after="0" w:before="0" w:line="240"/>
+              <w:jc w:val="left"/>
+            </w:pPr>
+            <w:r>
+              <w:rPr>
+                <w:rFonts w:ascii="맑은 고딕" w:cs="맑은 고딕" w:eastAsia="맑은 고딕" w:hAnsi="맑은 고딕"/>
+                <w:sz w:val="19"/>
+                <w:szCs w:val="19"/>
+              </w:rPr>
+              <w:t xml:space="preserve">연극 영상·사진</w:t>
+            </w:r>
+          </w:p>
+        </w:tc>
+      </w:tr>
+      <w:tr>
+        <w:trPr>
+          <w:cantSplit/>
+          <w:trHeight w:val="280" w:hRule="atLeast"/>
+        </w:trPr>
+        <w:tc>
+          <w:tcPr>
+            <w:tcW w:type="dxa" w:w="1100"/>
+            <w:shd w:fill="FFF2CC" w:color="auto" w:val="clear"/>
+            <w:tcMar>
+              <w:top w:type="dxa" w:w="30"/>
+              <w:left w:type="dxa" w:w="100"/>
+              <w:bottom w:type="dxa" w:w="30"/>
+              <w:right w:type="dxa" w:w="100"/>
+            </w:tcMar>
+            <w:vAlign w:val="center"/>
+          </w:tcPr>
+          <w:p>
+            <w:pPr>
+              <w:spacing w:after="0" w:before="0" w:line="240"/>
+              <w:jc w:val="center"/>
+            </w:pPr>
+            <w:r>
+              <w:rPr>
+                <w:rFonts w:ascii="맑은 고딕" w:cs="맑은 고딕" w:eastAsia="맑은 고딕" w:hAnsi="맑은 고딕"/>
+                <w:sz w:val="19"/>
+                <w:szCs w:val="19"/>
+              </w:rPr>
+              <w:t xml:space="preserve">4</w:t>
+            </w:r>
+          </w:p>
+        </w:tc>
+        <w:tc>
+          <w:tcPr>
+            <w:tcW w:type="dxa" w:w="2900"/>
+            <w:shd w:fill="FFF2CC" w:color="auto" w:val="clear"/>
+            <w:tcMar>
+              <w:top w:type="dxa" w:w="30"/>
+              <w:left w:type="dxa" w:w="100"/>
+              <w:bottom w:type="dxa" w:w="30"/>
+              <w:right w:type="dxa" w:w="100"/>
+            </w:tcMar>
+            <w:vAlign w:val="center"/>
+          </w:tcPr>
+          <w:p>
+            <w:pPr>
+              <w:spacing w:after="0" w:before="0" w:line="240"/>
+              <w:jc w:val="left"/>
+            </w:pPr>
+            <w:r>
+              <w:rPr>
+                <w:rFonts w:ascii="맑은 고딕" w:cs="맑은 고딕" w:eastAsia="맑은 고딕" w:hAnsi="맑은 고딕"/>
+                <w:sz w:val="19"/>
+                <w:szCs w:val="19"/>
+              </w:rPr>
+              <w:t xml:space="preserve">자막 PC (PC형 자막기일 때)</w:t>
+            </w:r>
+          </w:p>
+        </w:tc>
+        <w:tc>
+          <w:tcPr>
+            <w:tcW w:type="dxa" w:w="3300"/>
+            <w:shd w:fill="FFF2CC" w:color="auto" w:val="clear"/>
+            <w:tcMar>
+              <w:top w:type="dxa" w:w="30"/>
+              <w:left w:type="dxa" w:w="100"/>
+              <w:bottom w:type="dxa" w:w="30"/>
+              <w:right w:type="dxa" w:w="100"/>
+            </w:tcMar>
+            <w:vAlign w:val="center"/>
+          </w:tcPr>
+          <w:p>
+            <w:pPr>
+              <w:spacing w:after="0" w:before="0" w:line="240"/>
+              <w:jc w:val="left"/>
+            </w:pPr>
+            <w:r>
+              <w:rPr>
+                <w:rFonts w:ascii="맑은 고딕" w:cs="맑은 고딕" w:eastAsia="맑은 고딕" w:hAnsi="맑은 고딕"/>
+                <w:sz w:val="19"/>
+                <w:szCs w:val="19"/>
+              </w:rPr>
+              <w:t xml:space="preserve">HDMI 2m</w:t>
+            </w:r>
+          </w:p>
+        </w:tc>
+        <w:tc>
+          <w:tcPr>
+            <w:tcW w:type="dxa" w:w="2906"/>
+            <w:shd w:fill="FFF2CC" w:color="auto" w:val="clear"/>
+            <w:tcMar>
+              <w:top w:type="dxa" w:w="30"/>
+              <w:left w:type="dxa" w:w="100"/>
+              <w:bottom w:type="dxa" w:w="30"/>
+              <w:right w:type="dxa" w:w="100"/>
+            </w:tcMar>
+            <w:vAlign w:val="center"/>
+          </w:tcPr>
+          <w:p>
+            <w:pPr>
+              <w:spacing w:after="0" w:before="0" w:line="240"/>
+              <w:jc w:val="left"/>
+            </w:pPr>
+            <w:r>
+              <w:rPr>
+                <w:rFonts w:ascii="맑은 고딕" w:cs="맑은 고딕" w:eastAsia="맑은 고딕" w:hAnsi="맑은 고딕"/>
+                <w:sz w:val="19"/>
+                <w:szCs w:val="19"/>
+              </w:rPr>
+              <w:t xml:space="preserve">믹서 키(루마·크로마) 기능으로 합성</w:t>
+            </w:r>
+          </w:p>
+        </w:tc>
+      </w:tr>
+    </w:tbl>
+    <w:p>
+      <w:pPr>
+        <w:spacing w:after="0" w:before="0" w:line="260"/>
+      </w:pPr>
+      <w:r>
+        <w:rPr>
+          <w:rFonts w:ascii="맑은 고딕" w:cs="맑은 고딕" w:eastAsia="맑은 고딕" w:hAnsi="맑은 고딕"/>
+          <w:color w:val="595959"/>
+          <w:sz w:val="17"/>
+          <w:szCs w:val="17"/>
+        </w:rPr>
+        <w:t xml:space="preserve">※ 자막기가 HDMI 입력·출력이 있는 장비면 입력 4번은 비우고, 믹서 출력 → 자막기 → 분배기 순서로 연결합니다.</w:t>
       </w:r>
     </w:p>
     <w:p>
@@ -1655,7 +2376,7 @@
                 <w:sz w:val="19"/>
                 <w:szCs w:val="19"/>
               </w:rPr>
-              <w:t xml:space="preserve">추가 품목 · AA 건전지 여분 8개</w:t>
+              <w:t xml:space="preserve">AA 건전지 여분 8개</w:t>
             </w:r>
           </w:p>
         </w:tc>
@@ -1787,32 +2508,34 @@
         <w:tc>
           <w:tcPr>
             <w:tcW w:type="dxa" w:w="4300"/>
-            <w:tcMar>
-              <w:top w:type="dxa" w:w="30"/>
-              <w:left w:type="dxa" w:w="100"/>
-              <w:bottom w:type="dxa" w:w="30"/>
-              <w:right w:type="dxa" w:w="100"/>
-            </w:tcMar>
-            <w:vAlign w:val="center"/>
-          </w:tcPr>
-          <w:p>
-            <w:pPr>
-              <w:spacing w:after="0" w:before="0" w:line="240"/>
-              <w:jc w:val="left"/>
-            </w:pPr>
-            <w:r>
-              <w:rPr>
-                <w:rFonts w:ascii="맑은 고딕" w:cs="맑은 고딕" w:eastAsia="맑은 고딕" w:hAnsi="맑은 고딕"/>
-                <w:sz w:val="19"/>
-                <w:szCs w:val="19"/>
-              </w:rPr>
-              <w:t xml:space="preserve">영상·사진 재생 노트북</w:t>
+            <w:shd w:fill="FFF2CC" w:color="auto" w:val="clear"/>
+            <w:tcMar>
+              <w:top w:type="dxa" w:w="30"/>
+              <w:left w:type="dxa" w:w="100"/>
+              <w:bottom w:type="dxa" w:w="30"/>
+              <w:right w:type="dxa" w:w="100"/>
+            </w:tcMar>
+            <w:vAlign w:val="center"/>
+          </w:tcPr>
+          <w:p>
+            <w:pPr>
+              <w:spacing w:after="0" w:before="0" w:line="240"/>
+              <w:jc w:val="left"/>
+            </w:pPr>
+            <w:r>
+              <w:rPr>
+                <w:rFonts w:ascii="맑은 고딕" w:cs="맑은 고딕" w:eastAsia="맑은 고딕" w:hAnsi="맑은 고딕"/>
+                <w:sz w:val="19"/>
+                <w:szCs w:val="19"/>
+              </w:rPr>
+              <w:t xml:space="preserve">영상 믹서</w:t>
             </w:r>
           </w:p>
         </w:tc>
         <w:tc>
           <w:tcPr>
             <w:tcW w:type="dxa" w:w="1100"/>
+            <w:shd w:fill="FFF2CC" w:color="auto" w:val="clear"/>
             <w:tcMar>
               <w:top w:type="dxa" w:w="30"/>
               <w:left w:type="dxa" w:w="100"/>
@@ -1839,26 +2562,27 @@
         <w:tc>
           <w:tcPr>
             <w:tcW w:type="dxa" w:w="4806"/>
-            <w:tcMar>
-              <w:top w:type="dxa" w:w="30"/>
-              <w:left w:type="dxa" w:w="100"/>
-              <w:bottom w:type="dxa" w:w="30"/>
-              <w:right w:type="dxa" w:w="100"/>
-            </w:tcMar>
-            <w:vAlign w:val="center"/>
-          </w:tcPr>
-          <w:p>
-            <w:pPr>
-              <w:spacing w:after="0" w:before="0" w:line="240"/>
-              <w:jc w:val="left"/>
-            </w:pPr>
-            <w:r>
-              <w:rPr>
-                <w:rFonts w:ascii="맑은 고딕" w:cs="맑은 고딕" w:eastAsia="맑은 고딕" w:hAnsi="맑은 고딕"/>
-                <w:sz w:val="19"/>
-                <w:szCs w:val="19"/>
-              </w:rPr>
-              <w:t xml:space="preserve">연극용</w:t>
+            <w:shd w:fill="FFF2CC" w:color="auto" w:val="clear"/>
+            <w:tcMar>
+              <w:top w:type="dxa" w:w="30"/>
+              <w:left w:type="dxa" w:w="100"/>
+              <w:bottom w:type="dxa" w:w="30"/>
+              <w:right w:type="dxa" w:w="100"/>
+            </w:tcMar>
+            <w:vAlign w:val="center"/>
+          </w:tcPr>
+          <w:p>
+            <w:pPr>
+              <w:spacing w:after="0" w:before="0" w:line="240"/>
+              <w:jc w:val="left"/>
+            </w:pPr>
+            <w:r>
+              <w:rPr>
+                <w:rFonts w:ascii="맑은 고딕" w:cs="맑은 고딕" w:eastAsia="맑은 고딕" w:hAnsi="맑은 고딕"/>
+                <w:sz w:val="19"/>
+                <w:szCs w:val="19"/>
+              </w:rPr>
+              <w:t xml:space="preserve">우리 장비 · HDMI 스위처 대신 사용</w:t>
             </w:r>
           </w:p>
         </w:tc>
@@ -1871,32 +2595,34 @@
         <w:tc>
           <w:tcPr>
             <w:tcW w:type="dxa" w:w="4300"/>
-            <w:tcMar>
-              <w:top w:type="dxa" w:w="30"/>
-              <w:left w:type="dxa" w:w="100"/>
-              <w:bottom w:type="dxa" w:w="30"/>
-              <w:right w:type="dxa" w:w="100"/>
-            </w:tcMar>
-            <w:vAlign w:val="center"/>
-          </w:tcPr>
-          <w:p>
-            <w:pPr>
-              <w:spacing w:after="0" w:before="0" w:line="240"/>
-              <w:jc w:val="left"/>
-            </w:pPr>
-            <w:r>
-              <w:rPr>
-                <w:rFonts w:ascii="맑은 고딕" w:cs="맑은 고딕" w:eastAsia="맑은 고딕" w:hAnsi="맑은 고딕"/>
-                <w:sz w:val="19"/>
-                <w:szCs w:val="19"/>
-              </w:rPr>
-              <w:t xml:space="preserve">성경 구절 자막 노트북 (또는 자막기)</w:t>
+            <w:shd w:fill="FFF2CC" w:color="auto" w:val="clear"/>
+            <w:tcMar>
+              <w:top w:type="dxa" w:w="30"/>
+              <w:left w:type="dxa" w:w="100"/>
+              <w:bottom w:type="dxa" w:w="30"/>
+              <w:right w:type="dxa" w:w="100"/>
+            </w:tcMar>
+            <w:vAlign w:val="center"/>
+          </w:tcPr>
+          <w:p>
+            <w:pPr>
+              <w:spacing w:after="0" w:before="0" w:line="240"/>
+              <w:jc w:val="left"/>
+            </w:pPr>
+            <w:r>
+              <w:rPr>
+                <w:rFonts w:ascii="맑은 고딕" w:cs="맑은 고딕" w:eastAsia="맑은 고딕" w:hAnsi="맑은 고딕"/>
+                <w:sz w:val="19"/>
+                <w:szCs w:val="19"/>
+              </w:rPr>
+              <w:t xml:space="preserve">자막기</w:t>
             </w:r>
           </w:p>
         </w:tc>
         <w:tc>
           <w:tcPr>
             <w:tcW w:type="dxa" w:w="1100"/>
+            <w:shd w:fill="FFF2CC" w:color="auto" w:val="clear"/>
             <w:tcMar>
               <w:top w:type="dxa" w:w="30"/>
               <w:left w:type="dxa" w:w="100"/>
@@ -1923,26 +2649,27 @@
         <w:tc>
           <w:tcPr>
             <w:tcW w:type="dxa" w:w="4806"/>
-            <w:tcMar>
-              <w:top w:type="dxa" w:w="30"/>
-              <w:left w:type="dxa" w:w="100"/>
-              <w:bottom w:type="dxa" w:w="30"/>
-              <w:right w:type="dxa" w:w="100"/>
-            </w:tcMar>
-            <w:vAlign w:val="center"/>
-          </w:tcPr>
-          <w:p>
-            <w:pPr>
-              <w:spacing w:after="0" w:before="0" w:line="240"/>
-              <w:jc w:val="left"/>
-            </w:pPr>
-            <w:r>
-              <w:rPr>
-                <w:rFonts w:ascii="맑은 고딕" w:cs="맑은 고딕" w:eastAsia="맑은 고딕" w:hAnsi="맑은 고딕"/>
-                <w:sz w:val="19"/>
-                <w:szCs w:val="19"/>
-              </w:rPr>
-              <w:t xml:space="preserve">말씀 시간</w:t>
+            <w:shd w:fill="FFF2CC" w:color="auto" w:val="clear"/>
+            <w:tcMar>
+              <w:top w:type="dxa" w:w="30"/>
+              <w:left w:type="dxa" w:w="100"/>
+              <w:bottom w:type="dxa" w:w="30"/>
+              <w:right w:type="dxa" w:w="100"/>
+            </w:tcMar>
+            <w:vAlign w:val="center"/>
+          </w:tcPr>
+          <w:p>
+            <w:pPr>
+              <w:spacing w:after="0" w:before="0" w:line="240"/>
+              <w:jc w:val="left"/>
+            </w:pPr>
+            <w:r>
+              <w:rPr>
+                <w:rFonts w:ascii="맑은 고딕" w:cs="맑은 고딕" w:eastAsia="맑은 고딕" w:hAnsi="맑은 고딕"/>
+                <w:sz w:val="19"/>
+                <w:szCs w:val="19"/>
+              </w:rPr>
+              <w:t xml:space="preserve">우리 장비 · 성경 구절</w:t>
             </w:r>
           </w:p>
         </w:tc>
@@ -1955,32 +2682,34 @@
         <w:tc>
           <w:tcPr>
             <w:tcW w:type="dxa" w:w="4300"/>
-            <w:tcMar>
-              <w:top w:type="dxa" w:w="30"/>
-              <w:left w:type="dxa" w:w="100"/>
-              <w:bottom w:type="dxa" w:w="30"/>
-              <w:right w:type="dxa" w:w="100"/>
-            </w:tcMar>
-            <w:vAlign w:val="center"/>
-          </w:tcPr>
-          <w:p>
-            <w:pPr>
-              <w:spacing w:after="0" w:before="0" w:line="240"/>
-              <w:jc w:val="left"/>
-            </w:pPr>
-            <w:r>
-              <w:rPr>
-                <w:rFonts w:ascii="맑은 고딕" w:cs="맑은 고딕" w:eastAsia="맑은 고딕" w:hAnsi="맑은 고딕"/>
-                <w:sz w:val="19"/>
-                <w:szCs w:val="19"/>
-              </w:rPr>
-              <w:t xml:space="preserve">HDMI 스위처 2×1 (또는 4×1)</w:t>
+            <w:shd w:fill="FFF2CC" w:color="auto" w:val="clear"/>
+            <w:tcMar>
+              <w:top w:type="dxa" w:w="30"/>
+              <w:left w:type="dxa" w:w="100"/>
+              <w:bottom w:type="dxa" w:w="30"/>
+              <w:right w:type="dxa" w:w="100"/>
+            </w:tcMar>
+            <w:vAlign w:val="center"/>
+          </w:tcPr>
+          <w:p>
+            <w:pPr>
+              <w:spacing w:after="0" w:before="0" w:line="240"/>
+              <w:jc w:val="left"/>
+            </w:pPr>
+            <w:r>
+              <w:rPr>
+                <w:rFonts w:ascii="맑은 고딕" w:cs="맑은 고딕" w:eastAsia="맑은 고딕" w:hAnsi="맑은 고딕"/>
+                <w:sz w:val="19"/>
+                <w:szCs w:val="19"/>
+              </w:rPr>
+              <w:t xml:space="preserve">캠코더 (광학 줌 20배 이상)</w:t>
             </w:r>
           </w:p>
         </w:tc>
         <w:tc>
           <w:tcPr>
             <w:tcW w:type="dxa" w:w="1100"/>
+            <w:shd w:fill="FFF2CC" w:color="auto" w:val="clear"/>
             <w:tcMar>
               <w:top w:type="dxa" w:w="30"/>
               <w:left w:type="dxa" w:w="100"/>
@@ -2007,26 +2736,27 @@
         <w:tc>
           <w:tcPr>
             <w:tcW w:type="dxa" w:w="4806"/>
-            <w:tcMar>
-              <w:top w:type="dxa" w:w="30"/>
-              <w:left w:type="dxa" w:w="100"/>
-              <w:bottom w:type="dxa" w:w="30"/>
-              <w:right w:type="dxa" w:w="100"/>
-            </w:tcMar>
-            <w:vAlign w:val="center"/>
-          </w:tcPr>
-          <w:p>
-            <w:pPr>
-              <w:spacing w:after="0" w:before="0" w:line="240"/>
-              <w:jc w:val="left"/>
-            </w:pPr>
-            <w:r>
-              <w:rPr>
-                <w:rFonts w:ascii="맑은 고딕" w:cs="맑은 고딕" w:eastAsia="맑은 고딕" w:hAnsi="맑은 고딕"/>
-                <w:sz w:val="19"/>
-                <w:szCs w:val="19"/>
-              </w:rPr>
-              <w:t xml:space="preserve">노트북 두 대 화면 전환</w:t>
+            <w:shd w:fill="FFF2CC" w:color="auto" w:val="clear"/>
+            <w:tcMar>
+              <w:top w:type="dxa" w:w="30"/>
+              <w:left w:type="dxa" w:w="100"/>
+              <w:bottom w:type="dxa" w:w="30"/>
+              <w:right w:type="dxa" w:w="100"/>
+            </w:tcMar>
+            <w:vAlign w:val="center"/>
+          </w:tcPr>
+          <w:p>
+            <w:pPr>
+              <w:spacing w:after="0" w:before="0" w:line="240"/>
+              <w:jc w:val="left"/>
+            </w:pPr>
+            <w:r>
+              <w:rPr>
+                <w:rFonts w:ascii="맑은 고딕" w:cs="맑은 고딕" w:eastAsia="맑은 고딕" w:hAnsi="맑은 고딕"/>
+                <w:sz w:val="19"/>
+                <w:szCs w:val="19"/>
+              </w:rPr>
+              <w:t xml:space="preserve">중앙 카메라 · 디지털 줌은 끄기</w:t>
             </w:r>
           </w:p>
         </w:tc>
@@ -2039,32 +2769,34 @@
         <w:tc>
           <w:tcPr>
             <w:tcW w:type="dxa" w:w="4300"/>
-            <w:tcMar>
-              <w:top w:type="dxa" w:w="30"/>
-              <w:left w:type="dxa" w:w="100"/>
-              <w:bottom w:type="dxa" w:w="30"/>
-              <w:right w:type="dxa" w:w="100"/>
-            </w:tcMar>
-            <w:vAlign w:val="center"/>
-          </w:tcPr>
-          <w:p>
-            <w:pPr>
-              <w:spacing w:after="0" w:before="0" w:line="240"/>
-              <w:jc w:val="left"/>
-            </w:pPr>
-            <w:r>
-              <w:rPr>
-                <w:rFonts w:ascii="맑은 고딕" w:cs="맑은 고딕" w:eastAsia="맑은 고딕" w:hAnsi="맑은 고딕"/>
-                <w:sz w:val="19"/>
-                <w:szCs w:val="19"/>
-              </w:rPr>
-              <w:t xml:space="preserve">HDMI 분배기 1×2</w:t>
+            <w:shd w:fill="FFF2CC" w:color="auto" w:val="clear"/>
+            <w:tcMar>
+              <w:top w:type="dxa" w:w="30"/>
+              <w:left w:type="dxa" w:w="100"/>
+              <w:bottom w:type="dxa" w:w="30"/>
+              <w:right w:type="dxa" w:w="100"/>
+            </w:tcMar>
+            <w:vAlign w:val="center"/>
+          </w:tcPr>
+          <w:p>
+            <w:pPr>
+              <w:spacing w:after="0" w:before="0" w:line="240"/>
+              <w:jc w:val="left"/>
+            </w:pPr>
+            <w:r>
+              <w:rPr>
+                <w:rFonts w:ascii="맑은 고딕" w:cs="맑은 고딕" w:eastAsia="맑은 고딕" w:hAnsi="맑은 고딕"/>
+                <w:sz w:val="19"/>
+                <w:szCs w:val="19"/>
+              </w:rPr>
+              <w:t xml:space="preserve">비디오 삼각대 (높이 1.8m 이상)</w:t>
             </w:r>
           </w:p>
         </w:tc>
         <w:tc>
           <w:tcPr>
             <w:tcW w:type="dxa" w:w="1100"/>
+            <w:shd w:fill="FFF2CC" w:color="auto" w:val="clear"/>
             <w:tcMar>
               <w:top w:type="dxa" w:w="30"/>
               <w:left w:type="dxa" w:w="100"/>
@@ -2091,26 +2823,27 @@
         <w:tc>
           <w:tcPr>
             <w:tcW w:type="dxa" w:w="4806"/>
-            <w:tcMar>
-              <w:top w:type="dxa" w:w="30"/>
-              <w:left w:type="dxa" w:w="100"/>
-              <w:bottom w:type="dxa" w:w="30"/>
-              <w:right w:type="dxa" w:w="100"/>
-            </w:tcMar>
-            <w:vAlign w:val="center"/>
-          </w:tcPr>
-          <w:p>
-            <w:pPr>
-              <w:spacing w:after="0" w:before="0" w:line="240"/>
-              <w:jc w:val="left"/>
-            </w:pPr>
-            <w:r>
-              <w:rPr>
-                <w:rFonts w:ascii="맑은 고딕" w:cs="맑은 고딕" w:eastAsia="맑은 고딕" w:hAnsi="맑은 고딕"/>
-                <w:sz w:val="19"/>
-                <w:szCs w:val="19"/>
-              </w:rPr>
-              <w:t xml:space="preserve">빔과 모니터 TV에 같은 화면</w:t>
+            <w:shd w:fill="FFF2CC" w:color="auto" w:val="clear"/>
+            <w:tcMar>
+              <w:top w:type="dxa" w:w="30"/>
+              <w:left w:type="dxa" w:w="100"/>
+              <w:bottom w:type="dxa" w:w="30"/>
+              <w:right w:type="dxa" w:w="100"/>
+            </w:tcMar>
+            <w:vAlign w:val="center"/>
+          </w:tcPr>
+          <w:p>
+            <w:pPr>
+              <w:spacing w:after="0" w:before="0" w:line="240"/>
+              <w:jc w:val="left"/>
+            </w:pPr>
+            <w:r>
+              <w:rPr>
+                <w:rFonts w:ascii="맑은 고딕" w:cs="맑은 고딕" w:eastAsia="맑은 고딕" w:hAnsi="맑은 고딕"/>
+                <w:sz w:val="19"/>
+                <w:szCs w:val="19"/>
+              </w:rPr>
+              <w:t xml:space="preserve">앞사람 머리에 안 가리게</w:t>
             </w:r>
           </w:p>
         </w:tc>
@@ -2123,78 +2856,81 @@
         <w:tc>
           <w:tcPr>
             <w:tcW w:type="dxa" w:w="4300"/>
-            <w:tcMar>
-              <w:top w:type="dxa" w:w="30"/>
-              <w:left w:type="dxa" w:w="100"/>
-              <w:bottom w:type="dxa" w:w="30"/>
-              <w:right w:type="dxa" w:w="100"/>
-            </w:tcMar>
-            <w:vAlign w:val="center"/>
-          </w:tcPr>
-          <w:p>
-            <w:pPr>
-              <w:spacing w:after="0" w:before="0" w:line="240"/>
-              <w:jc w:val="left"/>
-            </w:pPr>
-            <w:r>
-              <w:rPr>
-                <w:rFonts w:ascii="맑은 고딕" w:cs="맑은 고딕" w:eastAsia="맑은 고딕" w:hAnsi="맑은 고딕"/>
-                <w:sz w:val="19"/>
-                <w:szCs w:val="19"/>
-              </w:rPr>
-              <w:t xml:space="preserve">HDMI 연장기 (랜선용, 송신기 + 수신기, 50m 이상)</w:t>
+            <w:shd w:fill="FFF2CC" w:color="auto" w:val="clear"/>
+            <w:tcMar>
+              <w:top w:type="dxa" w:w="30"/>
+              <w:left w:type="dxa" w:w="100"/>
+              <w:bottom w:type="dxa" w:w="30"/>
+              <w:right w:type="dxa" w:w="100"/>
+            </w:tcMar>
+            <w:vAlign w:val="center"/>
+          </w:tcPr>
+          <w:p>
+            <w:pPr>
+              <w:spacing w:after="0" w:before="0" w:line="240"/>
+              <w:jc w:val="left"/>
+            </w:pPr>
+            <w:r>
+              <w:rPr>
+                <w:rFonts w:ascii="맑은 고딕" w:cs="맑은 고딕" w:eastAsia="맑은 고딕" w:hAnsi="맑은 고딕"/>
+                <w:sz w:val="19"/>
+                <w:szCs w:val="19"/>
+              </w:rPr>
+              <w:t xml:space="preserve">카메라 전원 어댑터 · 예비 배터리</w:t>
             </w:r>
           </w:p>
         </w:tc>
         <w:tc>
           <w:tcPr>
             <w:tcW w:type="dxa" w:w="1100"/>
-            <w:tcMar>
-              <w:top w:type="dxa" w:w="30"/>
-              <w:left w:type="dxa" w:w="100"/>
-              <w:bottom w:type="dxa" w:w="30"/>
-              <w:right w:type="dxa" w:w="100"/>
-            </w:tcMar>
-            <w:vAlign w:val="center"/>
-          </w:tcPr>
-          <w:p>
-            <w:pPr>
-              <w:spacing w:after="0" w:before="0" w:line="240"/>
-              <w:jc w:val="center"/>
-            </w:pPr>
-            <w:r>
-              <w:rPr>
-                <w:rFonts w:ascii="맑은 고딕" w:cs="맑은 고딕" w:eastAsia="맑은 고딕" w:hAnsi="맑은 고딕"/>
-                <w:sz w:val="19"/>
-                <w:szCs w:val="19"/>
-              </w:rPr>
-              <w:t xml:space="preserve">1세트</w:t>
+            <w:shd w:fill="FFF2CC" w:color="auto" w:val="clear"/>
+            <w:tcMar>
+              <w:top w:type="dxa" w:w="30"/>
+              <w:left w:type="dxa" w:w="100"/>
+              <w:bottom w:type="dxa" w:w="30"/>
+              <w:right w:type="dxa" w:w="100"/>
+            </w:tcMar>
+            <w:vAlign w:val="center"/>
+          </w:tcPr>
+          <w:p>
+            <w:pPr>
+              <w:spacing w:after="0" w:before="0" w:line="240"/>
+              <w:jc w:val="center"/>
+            </w:pPr>
+            <w:r>
+              <w:rPr>
+                <w:rFonts w:ascii="맑은 고딕" w:cs="맑은 고딕" w:eastAsia="맑은 고딕" w:hAnsi="맑은 고딕"/>
+                <w:sz w:val="19"/>
+                <w:szCs w:val="19"/>
+              </w:rPr>
+              <w:t xml:space="preserve">1식</w:t>
             </w:r>
           </w:p>
         </w:tc>
         <w:tc>
           <w:tcPr>
             <w:tcW w:type="dxa" w:w="4806"/>
-            <w:tcMar>
-              <w:top w:type="dxa" w:w="30"/>
-              <w:left w:type="dxa" w:w="100"/>
-              <w:bottom w:type="dxa" w:w="30"/>
-              <w:right w:type="dxa" w:w="100"/>
-            </w:tcMar>
-            <w:vAlign w:val="center"/>
-          </w:tcPr>
-          <w:p>
-            <w:pPr>
-              <w:spacing w:after="0" w:before="0" w:line="240"/>
-              <w:jc w:val="left"/>
-            </w:pPr>
-            <w:r>
-              <w:rPr>
-                <w:rFonts w:ascii="맑은 고딕" w:cs="맑은 고딕" w:eastAsia="맑은 고딕" w:hAnsi="맑은 고딕"/>
-                <w:sz w:val="19"/>
-                <w:szCs w:val="19"/>
-              </w:rPr>
-              <w:t xml:space="preserve">HDMI 선은 15m 넘으면 화면이 끊김</w:t>
+            <w:shd w:fill="FFF2CC" w:color="auto" w:val="clear"/>
+            <w:tcMar>
+              <w:top w:type="dxa" w:w="30"/>
+              <w:left w:type="dxa" w:w="100"/>
+              <w:bottom w:type="dxa" w:w="30"/>
+              <w:right w:type="dxa" w:w="100"/>
+            </w:tcMar>
+            <w:vAlign w:val="center"/>
+          </w:tcPr>
+          <w:p>
+            <w:pPr>
+              <w:spacing w:after="0" w:before="0" w:line="240"/>
+              <w:jc w:val="left"/>
+            </w:pPr>
+            <w:r>
+              <w:rPr>
+                <w:rFonts w:ascii="맑은 고딕" w:cs="맑은 고딕" w:eastAsia="맑은 고딕" w:hAnsi="맑은 고딕"/>
+                <w:sz w:val="19"/>
+                <w:szCs w:val="19"/>
+              </w:rPr>
+              <w:t xml:space="preserve">배터리만으로는 2시간 어려움</w:t>
             </w:r>
           </w:p>
         </w:tc>
@@ -2207,32 +2943,34 @@
         <w:tc>
           <w:tcPr>
             <w:tcW w:type="dxa" w:w="4300"/>
-            <w:tcMar>
-              <w:top w:type="dxa" w:w="30"/>
-              <w:left w:type="dxa" w:w="100"/>
-              <w:bottom w:type="dxa" w:w="30"/>
-              <w:right w:type="dxa" w:w="100"/>
-            </w:tcMar>
-            <w:vAlign w:val="center"/>
-          </w:tcPr>
-          <w:p>
-            <w:pPr>
-              <w:spacing w:after="0" w:before="0" w:line="240"/>
-              <w:jc w:val="left"/>
-            </w:pPr>
-            <w:r>
-              <w:rPr>
-                <w:rFonts w:ascii="맑은 고딕" w:cs="맑은 고딕" w:eastAsia="맑은 고딕" w:hAnsi="맑은 고딕"/>
-                <w:sz w:val="19"/>
-                <w:szCs w:val="19"/>
-              </w:rPr>
-              <w:t xml:space="preserve">모니터 TV + 스탠드</w:t>
+            <w:shd w:fill="FFF2CC" w:color="auto" w:val="clear"/>
+            <w:tcMar>
+              <w:top w:type="dxa" w:w="30"/>
+              <w:left w:type="dxa" w:w="100"/>
+              <w:bottom w:type="dxa" w:w="30"/>
+              <w:right w:type="dxa" w:w="100"/>
+            </w:tcMar>
+            <w:vAlign w:val="center"/>
+          </w:tcPr>
+          <w:p>
+            <w:pPr>
+              <w:spacing w:after="0" w:before="0" w:line="240"/>
+              <w:jc w:val="left"/>
+            </w:pPr>
+            <w:r>
+              <w:rPr>
+                <w:rFonts w:ascii="맑은 고딕" w:cs="맑은 고딕" w:eastAsia="맑은 고딕" w:hAnsi="맑은 고딕"/>
+                <w:sz w:val="19"/>
+                <w:szCs w:val="19"/>
+              </w:rPr>
+              <w:t xml:space="preserve">운영자용 모니터</w:t>
             </w:r>
           </w:p>
         </w:tc>
         <w:tc>
           <w:tcPr>
             <w:tcW w:type="dxa" w:w="1100"/>
+            <w:shd w:fill="FFF2CC" w:color="auto" w:val="clear"/>
             <w:tcMar>
               <w:top w:type="dxa" w:w="30"/>
               <w:left w:type="dxa" w:w="100"/>
@@ -2259,26 +2997,27 @@
         <w:tc>
           <w:tcPr>
             <w:tcW w:type="dxa" w:w="4806"/>
-            <w:tcMar>
-              <w:top w:type="dxa" w:w="30"/>
-              <w:left w:type="dxa" w:w="100"/>
-              <w:bottom w:type="dxa" w:w="30"/>
-              <w:right w:type="dxa" w:w="100"/>
-            </w:tcMar>
-            <w:vAlign w:val="center"/>
-          </w:tcPr>
-          <w:p>
-            <w:pPr>
-              <w:spacing w:after="0" w:before="0" w:line="240"/>
-              <w:jc w:val="left"/>
-            </w:pPr>
-            <w:r>
-              <w:rPr>
-                <w:rFonts w:ascii="맑은 고딕" w:cs="맑은 고딕" w:eastAsia="맑은 고딕" w:hAnsi="맑은 고딕"/>
-                <w:sz w:val="19"/>
-                <w:szCs w:val="19"/>
-              </w:rPr>
-              <w:t xml:space="preserve">강대상 앞</w:t>
+            <w:shd w:fill="FFF2CC" w:color="auto" w:val="clear"/>
+            <w:tcMar>
+              <w:top w:type="dxa" w:w="30"/>
+              <w:left w:type="dxa" w:w="100"/>
+              <w:bottom w:type="dxa" w:w="30"/>
+              <w:right w:type="dxa" w:w="100"/>
+            </w:tcMar>
+            <w:vAlign w:val="center"/>
+          </w:tcPr>
+          <w:p>
+            <w:pPr>
+              <w:spacing w:after="0" w:before="0" w:line="240"/>
+              <w:jc w:val="left"/>
+            </w:pPr>
+            <w:r>
+              <w:rPr>
+                <w:rFonts w:ascii="맑은 고딕" w:cs="맑은 고딕" w:eastAsia="맑은 고딕" w:hAnsi="맑은 고딕"/>
+                <w:sz w:val="19"/>
+                <w:szCs w:val="19"/>
+              </w:rPr>
+              <w:t xml:space="preserve">믹서 멀티뷰 확인</w:t>
             </w:r>
           </w:p>
         </w:tc>
@@ -2310,7 +3049,7 @@
                 <w:sz w:val="19"/>
                 <w:szCs w:val="19"/>
               </w:rPr>
-              <w:t xml:space="preserve">빔프로젝터 · 스크린</w:t>
+              <w:t xml:space="preserve">영상·사진 재생 노트북</w:t>
             </w:r>
           </w:p>
         </w:tc>
@@ -2336,7 +3075,7 @@
                 <w:sz w:val="19"/>
                 <w:szCs w:val="19"/>
               </w:rPr>
-              <w:t xml:space="preserve">—</w:t>
+              <w:t xml:space="preserve">1</w:t>
             </w:r>
           </w:p>
         </w:tc>
@@ -2362,42 +3101,7 @@
                 <w:sz w:val="19"/>
                 <w:szCs w:val="19"/>
               </w:rPr>
-              <w:t xml:space="preserve">오디토리움 장비 사용</w:t>
-            </w:r>
-          </w:p>
-        </w:tc>
-      </w:tr>
-      <w:tr>
-        <w:trPr>
-          <w:cantSplit/>
-        </w:trPr>
-        <w:tc>
-          <w:tcPr>
-            <w:tcW w:type="dxa" w:w="10206"/>
-            <w:gridSpan w:val="3"/>
-            <w:shd w:fill="F2F2F2" w:color="auto" w:val="clear"/>
-            <w:tcMar>
-              <w:top w:type="dxa" w:w="30"/>
-              <w:left w:type="dxa" w:w="100"/>
-              <w:bottom w:type="dxa" w:w="30"/>
-              <w:right w:type="dxa" w:w="100"/>
-            </w:tcMar>
-            <w:vAlign w:val="center"/>
-          </w:tcPr>
-          <w:p>
-            <w:pPr>
-              <w:spacing w:after="0" w:before="0" w:line="240"/>
-              <w:jc w:val="left"/>
-            </w:pPr>
-            <w:r>
-              <w:rPr>
-                <w:rFonts w:ascii="맑은 고딕" w:cs="맑은 고딕" w:eastAsia="맑은 고딕" w:hAnsi="맑은 고딕"/>
-                <w:b/>
-                <w:bCs/>
-                <w:sz w:val="19"/>
-                <w:szCs w:val="19"/>
-              </w:rPr>
-              <w:t xml:space="preserve">전원 · 기타</w:t>
+              <w:t xml:space="preserve">연극용</w:t>
             </w:r>
           </w:p>
         </w:tc>
@@ -2429,7 +3133,7 @@
                 <w:sz w:val="19"/>
                 <w:szCs w:val="19"/>
               </w:rPr>
-              <w:t xml:space="preserve">전원 릴선 30m</w:t>
+              <w:t xml:space="preserve">HDMI 분배기 1×2</w:t>
             </w:r>
           </w:p>
         </w:tc>
@@ -2455,7 +3159,7 @@
                 <w:sz w:val="19"/>
                 <w:szCs w:val="19"/>
               </w:rPr>
-              <w:t xml:space="preserve">2</w:t>
+              <w:t xml:space="preserve">1</w:t>
             </w:r>
           </w:p>
         </w:tc>
@@ -2481,7 +3185,7 @@
                 <w:sz w:val="19"/>
                 <w:szCs w:val="19"/>
               </w:rPr>
-              <w:t xml:space="preserve">무대(TV·연장기 수신기)용, 조정석용</w:t>
+              <w:t xml:space="preserve">빔과 모니터 TV에 같은 화면 (믹서 출력이 2개면 생략)</w:t>
             </w:r>
           </w:p>
         </w:tc>
@@ -2513,7 +3217,7 @@
                 <w:sz w:val="19"/>
                 <w:szCs w:val="19"/>
               </w:rPr>
-              <w:t xml:space="preserve">멀티탭 (6구)</w:t>
+              <w:t xml:space="preserve">HDMI 연장기 (랜선용, 송신기 + 수신기, 50m 이상)</w:t>
             </w:r>
           </w:p>
         </w:tc>
@@ -2539,7 +3243,7 @@
                 <w:sz w:val="19"/>
                 <w:szCs w:val="19"/>
               </w:rPr>
-              <w:t xml:space="preserve">4</w:t>
+              <w:t xml:space="preserve">1세트</w:t>
             </w:r>
           </w:p>
         </w:tc>
@@ -2565,7 +3269,7 @@
                 <w:sz w:val="19"/>
                 <w:szCs w:val="19"/>
               </w:rPr>
-              <w:t xml:space="preserve"/>
+              <w:t xml:space="preserve">HDMI 선은 15m 넘으면 화면이 끊김</w:t>
             </w:r>
           </w:p>
         </w:tc>
@@ -2597,6 +3301,380 @@
                 <w:sz w:val="19"/>
                 <w:szCs w:val="19"/>
               </w:rPr>
+              <w:t xml:space="preserve">모니터 TV + 스탠드</w:t>
+            </w:r>
+          </w:p>
+        </w:tc>
+        <w:tc>
+          <w:tcPr>
+            <w:tcW w:type="dxa" w:w="1100"/>
+            <w:tcMar>
+              <w:top w:type="dxa" w:w="30"/>
+              <w:left w:type="dxa" w:w="100"/>
+              <w:bottom w:type="dxa" w:w="30"/>
+              <w:right w:type="dxa" w:w="100"/>
+            </w:tcMar>
+            <w:vAlign w:val="center"/>
+          </w:tcPr>
+          <w:p>
+            <w:pPr>
+              <w:spacing w:after="0" w:before="0" w:line="240"/>
+              <w:jc w:val="center"/>
+            </w:pPr>
+            <w:r>
+              <w:rPr>
+                <w:rFonts w:ascii="맑은 고딕" w:cs="맑은 고딕" w:eastAsia="맑은 고딕" w:hAnsi="맑은 고딕"/>
+                <w:sz w:val="19"/>
+                <w:szCs w:val="19"/>
+              </w:rPr>
+              <w:t xml:space="preserve">1</w:t>
+            </w:r>
+          </w:p>
+        </w:tc>
+        <w:tc>
+          <w:tcPr>
+            <w:tcW w:type="dxa" w:w="4806"/>
+            <w:tcMar>
+              <w:top w:type="dxa" w:w="30"/>
+              <w:left w:type="dxa" w:w="100"/>
+              <w:bottom w:type="dxa" w:w="30"/>
+              <w:right w:type="dxa" w:w="100"/>
+            </w:tcMar>
+            <w:vAlign w:val="center"/>
+          </w:tcPr>
+          <w:p>
+            <w:pPr>
+              <w:spacing w:after="0" w:before="0" w:line="240"/>
+              <w:jc w:val="left"/>
+            </w:pPr>
+            <w:r>
+              <w:rPr>
+                <w:rFonts w:ascii="맑은 고딕" w:cs="맑은 고딕" w:eastAsia="맑은 고딕" w:hAnsi="맑은 고딕"/>
+                <w:sz w:val="19"/>
+                <w:szCs w:val="19"/>
+              </w:rPr>
+              <w:t xml:space="preserve">강대상 앞</w:t>
+            </w:r>
+          </w:p>
+        </w:tc>
+      </w:tr>
+      <w:tr>
+        <w:trPr>
+          <w:cantSplit/>
+          <w:trHeight w:val="280" w:hRule="atLeast"/>
+        </w:trPr>
+        <w:tc>
+          <w:tcPr>
+            <w:tcW w:type="dxa" w:w="4300"/>
+            <w:tcMar>
+              <w:top w:type="dxa" w:w="30"/>
+              <w:left w:type="dxa" w:w="100"/>
+              <w:bottom w:type="dxa" w:w="30"/>
+              <w:right w:type="dxa" w:w="100"/>
+            </w:tcMar>
+            <w:vAlign w:val="center"/>
+          </w:tcPr>
+          <w:p>
+            <w:pPr>
+              <w:spacing w:after="0" w:before="0" w:line="240"/>
+              <w:jc w:val="left"/>
+            </w:pPr>
+            <w:r>
+              <w:rPr>
+                <w:rFonts w:ascii="맑은 고딕" w:cs="맑은 고딕" w:eastAsia="맑은 고딕" w:hAnsi="맑은 고딕"/>
+                <w:sz w:val="19"/>
+                <w:szCs w:val="19"/>
+              </w:rPr>
+              <w:t xml:space="preserve">빔프로젝터 · 스크린</w:t>
+            </w:r>
+          </w:p>
+        </w:tc>
+        <w:tc>
+          <w:tcPr>
+            <w:tcW w:type="dxa" w:w="1100"/>
+            <w:tcMar>
+              <w:top w:type="dxa" w:w="30"/>
+              <w:left w:type="dxa" w:w="100"/>
+              <w:bottom w:type="dxa" w:w="30"/>
+              <w:right w:type="dxa" w:w="100"/>
+            </w:tcMar>
+            <w:vAlign w:val="center"/>
+          </w:tcPr>
+          <w:p>
+            <w:pPr>
+              <w:spacing w:after="0" w:before="0" w:line="240"/>
+              <w:jc w:val="center"/>
+            </w:pPr>
+            <w:r>
+              <w:rPr>
+                <w:rFonts w:ascii="맑은 고딕" w:cs="맑은 고딕" w:eastAsia="맑은 고딕" w:hAnsi="맑은 고딕"/>
+                <w:sz w:val="19"/>
+                <w:szCs w:val="19"/>
+              </w:rPr>
+              <w:t xml:space="preserve">—</w:t>
+            </w:r>
+          </w:p>
+        </w:tc>
+        <w:tc>
+          <w:tcPr>
+            <w:tcW w:type="dxa" w:w="4806"/>
+            <w:tcMar>
+              <w:top w:type="dxa" w:w="30"/>
+              <w:left w:type="dxa" w:w="100"/>
+              <w:bottom w:type="dxa" w:w="30"/>
+              <w:right w:type="dxa" w:w="100"/>
+            </w:tcMar>
+            <w:vAlign w:val="center"/>
+          </w:tcPr>
+          <w:p>
+            <w:pPr>
+              <w:spacing w:after="0" w:before="0" w:line="240"/>
+              <w:jc w:val="left"/>
+            </w:pPr>
+            <w:r>
+              <w:rPr>
+                <w:rFonts w:ascii="맑은 고딕" w:cs="맑은 고딕" w:eastAsia="맑은 고딕" w:hAnsi="맑은 고딕"/>
+                <w:sz w:val="19"/>
+                <w:szCs w:val="19"/>
+              </w:rPr>
+              <w:t xml:space="preserve">오디토리움 장비 사용</w:t>
+            </w:r>
+          </w:p>
+        </w:tc>
+      </w:tr>
+      <w:tr>
+        <w:trPr>
+          <w:cantSplit/>
+        </w:trPr>
+        <w:tc>
+          <w:tcPr>
+            <w:tcW w:type="dxa" w:w="10206"/>
+            <w:gridSpan w:val="3"/>
+            <w:shd w:fill="F2F2F2" w:color="auto" w:val="clear"/>
+            <w:tcMar>
+              <w:top w:type="dxa" w:w="30"/>
+              <w:left w:type="dxa" w:w="100"/>
+              <w:bottom w:type="dxa" w:w="30"/>
+              <w:right w:type="dxa" w:w="100"/>
+            </w:tcMar>
+            <w:vAlign w:val="center"/>
+          </w:tcPr>
+          <w:p>
+            <w:pPr>
+              <w:spacing w:after="0" w:before="0" w:line="240"/>
+              <w:jc w:val="left"/>
+            </w:pPr>
+            <w:r>
+              <w:rPr>
+                <w:rFonts w:ascii="맑은 고딕" w:cs="맑은 고딕" w:eastAsia="맑은 고딕" w:hAnsi="맑은 고딕"/>
+                <w:b/>
+                <w:bCs/>
+                <w:sz w:val="19"/>
+                <w:szCs w:val="19"/>
+              </w:rPr>
+              <w:t xml:space="preserve">전원 · 기타</w:t>
+            </w:r>
+          </w:p>
+        </w:tc>
+      </w:tr>
+      <w:tr>
+        <w:trPr>
+          <w:cantSplit/>
+          <w:trHeight w:val="280" w:hRule="atLeast"/>
+        </w:trPr>
+        <w:tc>
+          <w:tcPr>
+            <w:tcW w:type="dxa" w:w="4300"/>
+            <w:tcMar>
+              <w:top w:type="dxa" w:w="30"/>
+              <w:left w:type="dxa" w:w="100"/>
+              <w:bottom w:type="dxa" w:w="30"/>
+              <w:right w:type="dxa" w:w="100"/>
+            </w:tcMar>
+            <w:vAlign w:val="center"/>
+          </w:tcPr>
+          <w:p>
+            <w:pPr>
+              <w:spacing w:after="0" w:before="0" w:line="240"/>
+              <w:jc w:val="left"/>
+            </w:pPr>
+            <w:r>
+              <w:rPr>
+                <w:rFonts w:ascii="맑은 고딕" w:cs="맑은 고딕" w:eastAsia="맑은 고딕" w:hAnsi="맑은 고딕"/>
+                <w:sz w:val="19"/>
+                <w:szCs w:val="19"/>
+              </w:rPr>
+              <w:t xml:space="preserve">전원 릴선 30m</w:t>
+            </w:r>
+          </w:p>
+        </w:tc>
+        <w:tc>
+          <w:tcPr>
+            <w:tcW w:type="dxa" w:w="1100"/>
+            <w:tcMar>
+              <w:top w:type="dxa" w:w="30"/>
+              <w:left w:type="dxa" w:w="100"/>
+              <w:bottom w:type="dxa" w:w="30"/>
+              <w:right w:type="dxa" w:w="100"/>
+            </w:tcMar>
+            <w:vAlign w:val="center"/>
+          </w:tcPr>
+          <w:p>
+            <w:pPr>
+              <w:spacing w:after="0" w:before="0" w:line="240"/>
+              <w:jc w:val="center"/>
+            </w:pPr>
+            <w:r>
+              <w:rPr>
+                <w:rFonts w:ascii="맑은 고딕" w:cs="맑은 고딕" w:eastAsia="맑은 고딕" w:hAnsi="맑은 고딕"/>
+                <w:sz w:val="19"/>
+                <w:szCs w:val="19"/>
+              </w:rPr>
+              <w:t xml:space="preserve">2</w:t>
+            </w:r>
+          </w:p>
+        </w:tc>
+        <w:tc>
+          <w:tcPr>
+            <w:tcW w:type="dxa" w:w="4806"/>
+            <w:tcMar>
+              <w:top w:type="dxa" w:w="30"/>
+              <w:left w:type="dxa" w:w="100"/>
+              <w:bottom w:type="dxa" w:w="30"/>
+              <w:right w:type="dxa" w:w="100"/>
+            </w:tcMar>
+            <w:vAlign w:val="center"/>
+          </w:tcPr>
+          <w:p>
+            <w:pPr>
+              <w:spacing w:after="0" w:before="0" w:line="240"/>
+              <w:jc w:val="left"/>
+            </w:pPr>
+            <w:r>
+              <w:rPr>
+                <w:rFonts w:ascii="맑은 고딕" w:cs="맑은 고딕" w:eastAsia="맑은 고딕" w:hAnsi="맑은 고딕"/>
+                <w:sz w:val="19"/>
+                <w:szCs w:val="19"/>
+              </w:rPr>
+              <w:t xml:space="preserve">무대(TV·연장기 수신기)용, 조정석용</w:t>
+            </w:r>
+          </w:p>
+        </w:tc>
+      </w:tr>
+      <w:tr>
+        <w:trPr>
+          <w:cantSplit/>
+          <w:trHeight w:val="280" w:hRule="atLeast"/>
+        </w:trPr>
+        <w:tc>
+          <w:tcPr>
+            <w:tcW w:type="dxa" w:w="4300"/>
+            <w:shd w:fill="FFF2CC" w:color="auto" w:val="clear"/>
+            <w:tcMar>
+              <w:top w:type="dxa" w:w="30"/>
+              <w:left w:type="dxa" w:w="100"/>
+              <w:bottom w:type="dxa" w:w="30"/>
+              <w:right w:type="dxa" w:w="100"/>
+            </w:tcMar>
+            <w:vAlign w:val="center"/>
+          </w:tcPr>
+          <w:p>
+            <w:pPr>
+              <w:spacing w:after="0" w:before="0" w:line="240"/>
+              <w:jc w:val="left"/>
+            </w:pPr>
+            <w:r>
+              <w:rPr>
+                <w:rFonts w:ascii="맑은 고딕" w:cs="맑은 고딕" w:eastAsia="맑은 고딕" w:hAnsi="맑은 고딕"/>
+                <w:sz w:val="19"/>
+                <w:szCs w:val="19"/>
+              </w:rPr>
+              <w:t xml:space="preserve">멀티탭 (6구)</w:t>
+            </w:r>
+          </w:p>
+        </w:tc>
+        <w:tc>
+          <w:tcPr>
+            <w:tcW w:type="dxa" w:w="1100"/>
+            <w:shd w:fill="FFF2CC" w:color="auto" w:val="clear"/>
+            <w:tcMar>
+              <w:top w:type="dxa" w:w="30"/>
+              <w:left w:type="dxa" w:w="100"/>
+              <w:bottom w:type="dxa" w:w="30"/>
+              <w:right w:type="dxa" w:w="100"/>
+            </w:tcMar>
+            <w:vAlign w:val="center"/>
+          </w:tcPr>
+          <w:p>
+            <w:pPr>
+              <w:spacing w:after="0" w:before="0" w:line="240"/>
+              <w:jc w:val="center"/>
+            </w:pPr>
+            <w:r>
+              <w:rPr>
+                <w:rFonts w:ascii="맑은 고딕" w:cs="맑은 고딕" w:eastAsia="맑은 고딕" w:hAnsi="맑은 고딕"/>
+                <w:sz w:val="19"/>
+                <w:szCs w:val="19"/>
+              </w:rPr>
+              <w:t xml:space="preserve">5</w:t>
+            </w:r>
+          </w:p>
+        </w:tc>
+        <w:tc>
+          <w:tcPr>
+            <w:tcW w:type="dxa" w:w="4806"/>
+            <w:shd w:fill="FFF2CC" w:color="auto" w:val="clear"/>
+            <w:tcMar>
+              <w:top w:type="dxa" w:w="30"/>
+              <w:left w:type="dxa" w:w="100"/>
+              <w:bottom w:type="dxa" w:w="30"/>
+              <w:right w:type="dxa" w:w="100"/>
+            </w:tcMar>
+            <w:vAlign w:val="center"/>
+          </w:tcPr>
+          <w:p>
+            <w:pPr>
+              <w:spacing w:after="0" w:before="0" w:line="240"/>
+              <w:jc w:val="left"/>
+            </w:pPr>
+            <w:r>
+              <w:rPr>
+                <w:rFonts w:ascii="맑은 고딕" w:cs="맑은 고딕" w:eastAsia="맑은 고딕" w:hAnsi="맑은 고딕"/>
+                <w:sz w:val="19"/>
+                <w:szCs w:val="19"/>
+              </w:rPr>
+              <w:t xml:space="preserve">카메라·영상 믹서용 1개 추가</w:t>
+            </w:r>
+          </w:p>
+        </w:tc>
+      </w:tr>
+      <w:tr>
+        <w:trPr>
+          <w:cantSplit/>
+          <w:trHeight w:val="280" w:hRule="atLeast"/>
+        </w:trPr>
+        <w:tc>
+          <w:tcPr>
+            <w:tcW w:type="dxa" w:w="4300"/>
+            <w:tcMar>
+              <w:top w:type="dxa" w:w="30"/>
+              <w:left w:type="dxa" w:w="100"/>
+              <w:bottom w:type="dxa" w:w="30"/>
+              <w:right w:type="dxa" w:w="100"/>
+            </w:tcMar>
+            <w:vAlign w:val="center"/>
+          </w:tcPr>
+          <w:p>
+            <w:pPr>
+              <w:spacing w:after="0" w:before="0" w:line="240"/>
+              <w:jc w:val="left"/>
+            </w:pPr>
+            <w:r>
+              <w:rPr>
+                <w:rFonts w:ascii="맑은 고딕" w:cs="맑은 고딕" w:eastAsia="맑은 고딕" w:hAnsi="맑은 고딕"/>
+                <w:sz w:val="19"/>
+                <w:szCs w:val="19"/>
+              </w:rPr>
               <w:t xml:space="preserve">개퍼테이프 (청테이프)</w:t>
             </w:r>
           </w:p>
@@ -2649,7 +3727,7 @@
                 <w:sz w:val="19"/>
                 <w:szCs w:val="19"/>
               </w:rPr>
-              <w:t xml:space="preserve">통로에 지나가는 선 고정</w:t>
+              <w:t xml:space="preserve">통로 선·삼각대 다리 고정</w:t>
             </w:r>
           </w:p>
         </w:tc>
@@ -3698,58 +4776,61 @@
         <w:tc>
           <w:tcPr>
             <w:tcW w:type="dxa" w:w="3300"/>
-            <w:tcMar>
-              <w:top w:type="dxa" w:w="30"/>
-              <w:left w:type="dxa" w:w="100"/>
-              <w:bottom w:type="dxa" w:w="30"/>
-              <w:right w:type="dxa" w:w="100"/>
-            </w:tcMar>
-            <w:vAlign w:val="center"/>
-          </w:tcPr>
-          <w:p>
-            <w:pPr>
-              <w:spacing w:after="0" w:before="0" w:line="240"/>
-              <w:jc w:val="left"/>
-            </w:pPr>
-            <w:r>
-              <w:rPr>
-                <w:rFonts w:ascii="맑은 고딕" w:cs="맑은 고딕" w:eastAsia="맑은 고딕" w:hAnsi="맑은 고딕"/>
-                <w:sz w:val="19"/>
-                <w:szCs w:val="19"/>
-              </w:rPr>
-              <w:t xml:space="preserve">랜선 Cat6 (STP 권장)</w:t>
+            <w:shd w:fill="FFF2CC" w:color="auto" w:val="clear"/>
+            <w:tcMar>
+              <w:top w:type="dxa" w:w="30"/>
+              <w:left w:type="dxa" w:w="100"/>
+              <w:bottom w:type="dxa" w:w="30"/>
+              <w:right w:type="dxa" w:w="100"/>
+            </w:tcMar>
+            <w:vAlign w:val="center"/>
+          </w:tcPr>
+          <w:p>
+            <w:pPr>
+              <w:spacing w:after="0" w:before="0" w:line="240"/>
+              <w:jc w:val="left"/>
+            </w:pPr>
+            <w:r>
+              <w:rPr>
+                <w:rFonts w:ascii="맑은 고딕" w:cs="맑은 고딕" w:eastAsia="맑은 고딕" w:hAnsi="맑은 고딕"/>
+                <w:sz w:val="19"/>
+                <w:szCs w:val="19"/>
+              </w:rPr>
+              <w:t xml:space="preserve">HDMI 케이블</w:t>
             </w:r>
           </w:p>
         </w:tc>
         <w:tc>
           <w:tcPr>
             <w:tcW w:type="dxa" w:w="1150"/>
-            <w:tcMar>
-              <w:top w:type="dxa" w:w="30"/>
-              <w:left w:type="dxa" w:w="100"/>
-              <w:bottom w:type="dxa" w:w="30"/>
-              <w:right w:type="dxa" w:w="100"/>
-            </w:tcMar>
-            <w:vAlign w:val="center"/>
-          </w:tcPr>
-          <w:p>
-            <w:pPr>
-              <w:spacing w:after="0" w:before="0" w:line="240"/>
-              <w:jc w:val="center"/>
-            </w:pPr>
-            <w:r>
-              <w:rPr>
-                <w:rFonts w:ascii="맑은 고딕" w:cs="맑은 고딕" w:eastAsia="맑은 고딕" w:hAnsi="맑은 고딕"/>
-                <w:sz w:val="19"/>
-                <w:szCs w:val="19"/>
-              </w:rPr>
-              <w:t xml:space="preserve">50m</w:t>
+            <w:shd w:fill="FFF2CC" w:color="auto" w:val="clear"/>
+            <w:tcMar>
+              <w:top w:type="dxa" w:w="30"/>
+              <w:left w:type="dxa" w:w="100"/>
+              <w:bottom w:type="dxa" w:w="30"/>
+              <w:right w:type="dxa" w:w="100"/>
+            </w:tcMar>
+            <w:vAlign w:val="center"/>
+          </w:tcPr>
+          <w:p>
+            <w:pPr>
+              <w:spacing w:after="0" w:before="0" w:line="240"/>
+              <w:jc w:val="center"/>
+            </w:pPr>
+            <w:r>
+              <w:rPr>
+                <w:rFonts w:ascii="맑은 고딕" w:cs="맑은 고딕" w:eastAsia="맑은 고딕" w:hAnsi="맑은 고딕"/>
+                <w:sz w:val="19"/>
+                <w:szCs w:val="19"/>
+              </w:rPr>
+              <w:t xml:space="preserve">5m</w:t>
             </w:r>
           </w:p>
         </w:tc>
         <w:tc>
           <w:tcPr>
             <w:tcW w:type="dxa" w:w="1450"/>
+            <w:shd w:fill="FFF2CC" w:color="auto" w:val="clear"/>
             <w:tcMar>
               <w:top w:type="dxa" w:w="30"/>
               <w:left w:type="dxa" w:w="100"/>
@@ -3776,26 +4857,27 @@
         <w:tc>
           <w:tcPr>
             <w:tcW w:type="dxa" w:w="4306"/>
-            <w:tcMar>
-              <w:top w:type="dxa" w:w="30"/>
-              <w:left w:type="dxa" w:w="100"/>
-              <w:bottom w:type="dxa" w:w="30"/>
-              <w:right w:type="dxa" w:w="100"/>
-            </w:tcMar>
-            <w:vAlign w:val="center"/>
-          </w:tcPr>
-          <w:p>
-            <w:pPr>
-              <w:spacing w:after="0" w:before="0" w:line="240"/>
-              <w:jc w:val="left"/>
-            </w:pPr>
-            <w:r>
-              <w:rPr>
-                <w:rFonts w:ascii="맑은 고딕" w:cs="맑은 고딕" w:eastAsia="맑은 고딕" w:hAnsi="맑은 고딕"/>
-                <w:sz w:val="19"/>
-                <w:szCs w:val="19"/>
-              </w:rPr>
-              <w:t xml:space="preserve">HDMI 연장기 송신기(조정석) → 수신기(모니터 TV)</w:t>
+            <w:shd w:fill="FFF2CC" w:color="auto" w:val="clear"/>
+            <w:tcMar>
+              <w:top w:type="dxa" w:w="30"/>
+              <w:left w:type="dxa" w:w="100"/>
+              <w:bottom w:type="dxa" w:w="30"/>
+              <w:right w:type="dxa" w:w="100"/>
+            </w:tcMar>
+            <w:vAlign w:val="center"/>
+          </w:tcPr>
+          <w:p>
+            <w:pPr>
+              <w:spacing w:after="0" w:before="0" w:line="240"/>
+              <w:jc w:val="left"/>
+            </w:pPr>
+            <w:r>
+              <w:rPr>
+                <w:rFonts w:ascii="맑은 고딕" w:cs="맑은 고딕" w:eastAsia="맑은 고딕" w:hAnsi="맑은 고딕"/>
+                <w:sz w:val="19"/>
+                <w:szCs w:val="19"/>
+              </w:rPr>
+              <w:t xml:space="preserve">중앙 카메라 → 영상 믹서 입력 1</w:t>
             </w:r>
           </w:p>
         </w:tc>
@@ -3808,104 +4890,108 @@
         <w:tc>
           <w:tcPr>
             <w:tcW w:type="dxa" w:w="3300"/>
-            <w:tcMar>
-              <w:top w:type="dxa" w:w="30"/>
-              <w:left w:type="dxa" w:w="100"/>
-              <w:bottom w:type="dxa" w:w="30"/>
-              <w:right w:type="dxa" w:w="100"/>
-            </w:tcMar>
-            <w:vAlign w:val="center"/>
-          </w:tcPr>
-          <w:p>
-            <w:pPr>
-              <w:spacing w:after="0" w:before="0" w:line="240"/>
-              <w:jc w:val="left"/>
-            </w:pPr>
-            <w:r>
-              <w:rPr>
-                <w:rFonts w:ascii="맑은 고딕" w:cs="맑은 고딕" w:eastAsia="맑은 고딕" w:hAnsi="맑은 고딕"/>
-                <w:sz w:val="19"/>
-                <w:szCs w:val="19"/>
-              </w:rPr>
-              <w:t xml:space="preserve">랜선 Cat6 (짧은 것)</w:t>
+            <w:shd w:fill="FFF2CC" w:color="auto" w:val="clear"/>
+            <w:tcMar>
+              <w:top w:type="dxa" w:w="30"/>
+              <w:left w:type="dxa" w:w="100"/>
+              <w:bottom w:type="dxa" w:w="30"/>
+              <w:right w:type="dxa" w:w="100"/>
+            </w:tcMar>
+            <w:vAlign w:val="center"/>
+          </w:tcPr>
+          <w:p>
+            <w:pPr>
+              <w:spacing w:after="0" w:before="0" w:line="240"/>
+              <w:jc w:val="left"/>
+            </w:pPr>
+            <w:r>
+              <w:rPr>
+                <w:rFonts w:ascii="맑은 고딕" w:cs="맑은 고딕" w:eastAsia="맑은 고딕" w:hAnsi="맑은 고딕"/>
+                <w:sz w:val="19"/>
+                <w:szCs w:val="19"/>
+              </w:rPr>
+              <w:t xml:space="preserve">HDMI 케이블</w:t>
             </w:r>
           </w:p>
         </w:tc>
         <w:tc>
           <w:tcPr>
             <w:tcW w:type="dxa" w:w="1150"/>
-            <w:tcMar>
-              <w:top w:type="dxa" w:w="30"/>
-              <w:left w:type="dxa" w:w="100"/>
-              <w:bottom w:type="dxa" w:w="30"/>
-              <w:right w:type="dxa" w:w="100"/>
-            </w:tcMar>
-            <w:vAlign w:val="center"/>
-          </w:tcPr>
-          <w:p>
-            <w:pPr>
-              <w:spacing w:after="0" w:before="0" w:line="240"/>
-              <w:jc w:val="center"/>
-            </w:pPr>
-            <w:r>
-              <w:rPr>
-                <w:rFonts w:ascii="맑은 고딕" w:cs="맑은 고딕" w:eastAsia="맑은 고딕" w:hAnsi="맑은 고딕"/>
-                <w:sz w:val="19"/>
-                <w:szCs w:val="19"/>
-              </w:rPr>
-              <w:t xml:space="preserve">1~2m</w:t>
+            <w:shd w:fill="FFF2CC" w:color="auto" w:val="clear"/>
+            <w:tcMar>
+              <w:top w:type="dxa" w:w="30"/>
+              <w:left w:type="dxa" w:w="100"/>
+              <w:bottom w:type="dxa" w:w="30"/>
+              <w:right w:type="dxa" w:w="100"/>
+            </w:tcMar>
+            <w:vAlign w:val="center"/>
+          </w:tcPr>
+          <w:p>
+            <w:pPr>
+              <w:spacing w:after="0" w:before="0" w:line="240"/>
+              <w:jc w:val="center"/>
+            </w:pPr>
+            <w:r>
+              <w:rPr>
+                <w:rFonts w:ascii="맑은 고딕" w:cs="맑은 고딕" w:eastAsia="맑은 고딕" w:hAnsi="맑은 고딕"/>
+                <w:sz w:val="19"/>
+                <w:szCs w:val="19"/>
+              </w:rPr>
+              <w:t xml:space="preserve">2m</w:t>
             </w:r>
           </w:p>
         </w:tc>
         <w:tc>
           <w:tcPr>
             <w:tcW w:type="dxa" w:w="1450"/>
-            <w:tcMar>
-              <w:top w:type="dxa" w:w="30"/>
-              <w:left w:type="dxa" w:w="100"/>
-              <w:bottom w:type="dxa" w:w="30"/>
-              <w:right w:type="dxa" w:w="100"/>
-            </w:tcMar>
-            <w:vAlign w:val="center"/>
-          </w:tcPr>
-          <w:p>
-            <w:pPr>
-              <w:spacing w:after="0" w:before="0" w:line="240"/>
-              <w:jc w:val="center"/>
-            </w:pPr>
-            <w:r>
-              <w:rPr>
-                <w:rFonts w:ascii="맑은 고딕" w:cs="맑은 고딕" w:eastAsia="맑은 고딕" w:hAnsi="맑은 고딕"/>
-                <w:sz w:val="19"/>
-                <w:szCs w:val="19"/>
-              </w:rPr>
-              <w:t xml:space="preserve">2</w:t>
+            <w:shd w:fill="FFF2CC" w:color="auto" w:val="clear"/>
+            <w:tcMar>
+              <w:top w:type="dxa" w:w="30"/>
+              <w:left w:type="dxa" w:w="100"/>
+              <w:bottom w:type="dxa" w:w="30"/>
+              <w:right w:type="dxa" w:w="100"/>
+            </w:tcMar>
+            <w:vAlign w:val="center"/>
+          </w:tcPr>
+          <w:p>
+            <w:pPr>
+              <w:spacing w:after="0" w:before="0" w:line="240"/>
+              <w:jc w:val="center"/>
+            </w:pPr>
+            <w:r>
+              <w:rPr>
+                <w:rFonts w:ascii="맑은 고딕" w:cs="맑은 고딕" w:eastAsia="맑은 고딕" w:hAnsi="맑은 고딕"/>
+                <w:sz w:val="19"/>
+                <w:szCs w:val="19"/>
+              </w:rPr>
+              <w:t xml:space="preserve">8 (예비 2)</w:t>
             </w:r>
           </w:p>
         </w:tc>
         <w:tc>
           <w:tcPr>
             <w:tcW w:type="dxa" w:w="4306"/>
-            <w:tcMar>
-              <w:top w:type="dxa" w:w="30"/>
-              <w:left w:type="dxa" w:w="100"/>
-              <w:bottom w:type="dxa" w:w="30"/>
-              <w:right w:type="dxa" w:w="100"/>
-            </w:tcMar>
-            <w:vAlign w:val="center"/>
-          </w:tcPr>
-          <w:p>
-            <w:pPr>
-              <w:spacing w:after="0" w:before="0" w:line="240"/>
-              <w:jc w:val="left"/>
-            </w:pPr>
-            <w:r>
-              <w:rPr>
-                <w:rFonts w:ascii="맑은 고딕" w:cs="맑은 고딕" w:eastAsia="맑은 고딕" w:hAnsi="맑은 고딕"/>
-                <w:sz w:val="19"/>
-                <w:szCs w:val="19"/>
-              </w:rPr>
-              <w:t xml:space="preserve">연장기·공유기 연결용 예비</w:t>
+            <w:shd w:fill="FFF2CC" w:color="auto" w:val="clear"/>
+            <w:tcMar>
+              <w:top w:type="dxa" w:w="30"/>
+              <w:left w:type="dxa" w:w="100"/>
+              <w:bottom w:type="dxa" w:w="30"/>
+              <w:right w:type="dxa" w:w="100"/>
+            </w:tcMar>
+            <w:vAlign w:val="center"/>
+          </w:tcPr>
+          <w:p>
+            <w:pPr>
+              <w:spacing w:after="0" w:before="0" w:line="240"/>
+              <w:jc w:val="left"/>
+            </w:pPr>
+            <w:r>
+              <w:rPr>
+                <w:rFonts w:ascii="맑은 고딕" w:cs="맑은 고딕" w:eastAsia="맑은 고딕" w:hAnsi="맑은 고딕"/>
+                <w:sz w:val="19"/>
+                <w:szCs w:val="19"/>
+              </w:rPr>
+              <w:t xml:space="preserve">노트북→믹서 1, 믹서→자막기→분배기 2, 분배기→연장기 1, 수신기→TV 1, 멀티뷰→운영자 모니터 1</w:t>
             </w:r>
           </w:p>
         </w:tc>
@@ -3963,7 +5049,7 @@
                 <w:sz w:val="19"/>
                 <w:szCs w:val="19"/>
               </w:rPr>
-              <w:t xml:space="preserve">2m</w:t>
+              <w:t xml:space="preserve">10~15m</w:t>
             </w:r>
           </w:p>
         </w:tc>
@@ -3989,7 +5075,7 @@
                 <w:sz w:val="19"/>
                 <w:szCs w:val="19"/>
               </w:rPr>
-              <w:t xml:space="preserve">8 (예비 2)</w:t>
+              <w:t xml:space="preserve">2 (예비 1)</w:t>
             </w:r>
           </w:p>
         </w:tc>
@@ -4015,7 +5101,7 @@
                 <w:sz w:val="19"/>
                 <w:szCs w:val="19"/>
               </w:rPr>
-              <w:t xml:space="preserve">노트북→스위처 2, 스위처→(자막기)→분배기 2, 분배기→연장기 1, 수신기→TV 1</w:t>
+              <w:t xml:space="preserve">분배기 → 빔프로젝터 입력 지점</w:t>
             </w:r>
           </w:p>
         </w:tc>
@@ -4047,7 +5133,7 @@
                 <w:sz w:val="19"/>
                 <w:szCs w:val="19"/>
               </w:rPr>
-              <w:t xml:space="preserve">HDMI 케이블</w:t>
+              <w:t xml:space="preserve">랜선 Cat6 (STP 권장)</w:t>
             </w:r>
           </w:p>
         </w:tc>
@@ -4073,7 +5159,7 @@
                 <w:sz w:val="19"/>
                 <w:szCs w:val="19"/>
               </w:rPr>
-              <w:t xml:space="preserve">10~15m</w:t>
+              <w:t xml:space="preserve">50m</w:t>
             </w:r>
           </w:p>
         </w:tc>
@@ -4125,7 +5211,117 @@
                 <w:sz w:val="19"/>
                 <w:szCs w:val="19"/>
               </w:rPr>
-              <w:t xml:space="preserve">분배기 → 빔프로젝터 입력 지점</w:t>
+              <w:t xml:space="preserve">HDMI 연장기 송신기(조정석) → 수신기(모니터 TV)</w:t>
+            </w:r>
+          </w:p>
+        </w:tc>
+      </w:tr>
+      <w:tr>
+        <w:trPr>
+          <w:cantSplit/>
+          <w:trHeight w:val="280" w:hRule="atLeast"/>
+        </w:trPr>
+        <w:tc>
+          <w:tcPr>
+            <w:tcW w:type="dxa" w:w="3300"/>
+            <w:tcMar>
+              <w:top w:type="dxa" w:w="30"/>
+              <w:left w:type="dxa" w:w="100"/>
+              <w:bottom w:type="dxa" w:w="30"/>
+              <w:right w:type="dxa" w:w="100"/>
+            </w:tcMar>
+            <w:vAlign w:val="center"/>
+          </w:tcPr>
+          <w:p>
+            <w:pPr>
+              <w:spacing w:after="0" w:before="0" w:line="240"/>
+              <w:jc w:val="left"/>
+            </w:pPr>
+            <w:r>
+              <w:rPr>
+                <w:rFonts w:ascii="맑은 고딕" w:cs="맑은 고딕" w:eastAsia="맑은 고딕" w:hAnsi="맑은 고딕"/>
+                <w:sz w:val="19"/>
+                <w:szCs w:val="19"/>
+              </w:rPr>
+              <w:t xml:space="preserve">랜선 Cat6 (짧은 것)</w:t>
+            </w:r>
+          </w:p>
+        </w:tc>
+        <w:tc>
+          <w:tcPr>
+            <w:tcW w:type="dxa" w:w="1150"/>
+            <w:tcMar>
+              <w:top w:type="dxa" w:w="30"/>
+              <w:left w:type="dxa" w:w="100"/>
+              <w:bottom w:type="dxa" w:w="30"/>
+              <w:right w:type="dxa" w:w="100"/>
+            </w:tcMar>
+            <w:vAlign w:val="center"/>
+          </w:tcPr>
+          <w:p>
+            <w:pPr>
+              <w:spacing w:after="0" w:before="0" w:line="240"/>
+              <w:jc w:val="center"/>
+            </w:pPr>
+            <w:r>
+              <w:rPr>
+                <w:rFonts w:ascii="맑은 고딕" w:cs="맑은 고딕" w:eastAsia="맑은 고딕" w:hAnsi="맑은 고딕"/>
+                <w:sz w:val="19"/>
+                <w:szCs w:val="19"/>
+              </w:rPr>
+              <w:t xml:space="preserve">1~2m</w:t>
+            </w:r>
+          </w:p>
+        </w:tc>
+        <w:tc>
+          <w:tcPr>
+            <w:tcW w:type="dxa" w:w="1450"/>
+            <w:tcMar>
+              <w:top w:type="dxa" w:w="30"/>
+              <w:left w:type="dxa" w:w="100"/>
+              <w:bottom w:type="dxa" w:w="30"/>
+              <w:right w:type="dxa" w:w="100"/>
+            </w:tcMar>
+            <w:vAlign w:val="center"/>
+          </w:tcPr>
+          <w:p>
+            <w:pPr>
+              <w:spacing w:after="0" w:before="0" w:line="240"/>
+              <w:jc w:val="center"/>
+            </w:pPr>
+            <w:r>
+              <w:rPr>
+                <w:rFonts w:ascii="맑은 고딕" w:cs="맑은 고딕" w:eastAsia="맑은 고딕" w:hAnsi="맑은 고딕"/>
+                <w:sz w:val="19"/>
+                <w:szCs w:val="19"/>
+              </w:rPr>
+              <w:t xml:space="preserve">2</w:t>
+            </w:r>
+          </w:p>
+        </w:tc>
+        <w:tc>
+          <w:tcPr>
+            <w:tcW w:type="dxa" w:w="4306"/>
+            <w:tcMar>
+              <w:top w:type="dxa" w:w="30"/>
+              <w:left w:type="dxa" w:w="100"/>
+              <w:bottom w:type="dxa" w:w="30"/>
+              <w:right w:type="dxa" w:w="100"/>
+            </w:tcMar>
+            <w:vAlign w:val="center"/>
+          </w:tcPr>
+          <w:p>
+            <w:pPr>
+              <w:spacing w:after="0" w:before="0" w:line="240"/>
+              <w:jc w:val="left"/>
+            </w:pPr>
+            <w:r>
+              <w:rPr>
+                <w:rFonts w:ascii="맑은 고딕" w:cs="맑은 고딕" w:eastAsia="맑은 고딕" w:hAnsi="맑은 고딕"/>
+                <w:sz w:val="19"/>
+                <w:szCs w:val="19"/>
+              </w:rPr>
+              <w:t xml:space="preserve">연장기·공유기 연결용 예비</w:t>
             </w:r>
           </w:p>
         </w:tc>
@@ -4170,7 +5366,7 @@
           <w:sz w:val="17"/>
           <w:szCs w:val="17"/>
         </w:rPr>
-        <w:t xml:space="preserve">※ 빔 입력 지점이 15m보다 멀면 HDMI 선 대신 HDMI 연장기 1세트를 더 쓰세요.</w:t>
+        <w:t xml:space="preserve">※ 빔 입력 지점이나 카메라 자리가 믹서에서 15m보다 멀면 HDMI 선 대신 HDMI 연장기 1세트를 더 쓰세요.</w:t>
       </w:r>
     </w:p>
     <w:p>
@@ -5052,6 +6248,93 @@
         <w:tc>
           <w:tcPr>
             <w:tcW w:type="dxa" w:w="4300"/>
+            <w:shd w:fill="FFF2CC" w:color="auto" w:val="clear"/>
+            <w:tcMar>
+              <w:top w:type="dxa" w:w="30"/>
+              <w:left w:type="dxa" w:w="100"/>
+              <w:bottom w:type="dxa" w:w="30"/>
+              <w:right w:type="dxa" w:w="100"/>
+            </w:tcMar>
+            <w:vAlign w:val="center"/>
+          </w:tcPr>
+          <w:p>
+            <w:pPr>
+              <w:spacing w:after="0" w:before="0" w:line="240"/>
+              <w:jc w:val="left"/>
+            </w:pPr>
+            <w:r>
+              <w:rPr>
+                <w:rFonts w:ascii="맑은 고딕" w:cs="맑은 고딕" w:eastAsia="맑은 고딕" w:hAnsi="맑은 고딕"/>
+                <w:sz w:val="19"/>
+                <w:szCs w:val="19"/>
+              </w:rPr>
+              <w:t xml:space="preserve">미니 HDMI → HDMI / 마이크로 HDMI → HDMI</w:t>
+            </w:r>
+          </w:p>
+        </w:tc>
+        <w:tc>
+          <w:tcPr>
+            <w:tcW w:type="dxa" w:w="1000"/>
+            <w:shd w:fill="FFF2CC" w:color="auto" w:val="clear"/>
+            <w:tcMar>
+              <w:top w:type="dxa" w:w="30"/>
+              <w:left w:type="dxa" w:w="100"/>
+              <w:bottom w:type="dxa" w:w="30"/>
+              <w:right w:type="dxa" w:w="100"/>
+            </w:tcMar>
+            <w:vAlign w:val="center"/>
+          </w:tcPr>
+          <w:p>
+            <w:pPr>
+              <w:spacing w:after="0" w:before="0" w:line="240"/>
+              <w:jc w:val="center"/>
+            </w:pPr>
+            <w:r>
+              <w:rPr>
+                <w:rFonts w:ascii="맑은 고딕" w:cs="맑은 고딕" w:eastAsia="맑은 고딕" w:hAnsi="맑은 고딕"/>
+                <w:sz w:val="19"/>
+                <w:szCs w:val="19"/>
+              </w:rPr>
+              <w:t xml:space="preserve">각 1</w:t>
+            </w:r>
+          </w:p>
+        </w:tc>
+        <w:tc>
+          <w:tcPr>
+            <w:tcW w:type="dxa" w:w="4906"/>
+            <w:shd w:fill="FFF2CC" w:color="auto" w:val="clear"/>
+            <w:tcMar>
+              <w:top w:type="dxa" w:w="30"/>
+              <w:left w:type="dxa" w:w="100"/>
+              <w:bottom w:type="dxa" w:w="30"/>
+              <w:right w:type="dxa" w:w="100"/>
+            </w:tcMar>
+            <w:vAlign w:val="center"/>
+          </w:tcPr>
+          <w:p>
+            <w:pPr>
+              <w:spacing w:after="0" w:before="0" w:line="240"/>
+              <w:jc w:val="left"/>
+            </w:pPr>
+            <w:r>
+              <w:rPr>
+                <w:rFonts w:ascii="맑은 고딕" w:cs="맑은 고딕" w:eastAsia="맑은 고딕" w:hAnsi="맑은 고딕"/>
+                <w:sz w:val="19"/>
+                <w:szCs w:val="19"/>
+              </w:rPr>
+              <w:t xml:space="preserve">캠코더 출력 단자가 작은 HDMI일 때</w:t>
+            </w:r>
+          </w:p>
+        </w:tc>
+      </w:tr>
+      <w:tr>
+        <w:trPr>
+          <w:cantSplit/>
+          <w:trHeight w:val="280" w:hRule="atLeast"/>
+        </w:trPr>
+        <w:tc>
+          <w:tcPr>
+            <w:tcW w:type="dxa" w:w="4300"/>
             <w:tcMar>
               <w:top w:type="dxa" w:w="30"/>
               <w:left w:type="dxa" w:w="100"/>
@@ -5480,7 +6763,331 @@
           <w:sz w:val="25"/>
           <w:szCs w:val="25"/>
         </w:rPr>
-        <w:t xml:space="preserve">4. 세팅 전 벡스코 담당자에게 확인할 것</w:t>
+        <w:t xml:space="preserve">4. 중앙 카메라 · 영상 믹서 세팅</w:t>
+      </w:r>
+    </w:p>
+    <w:p>
+      <w:pPr>
+        <w:spacing w:after="50" w:before="0" w:line="260"/>
+      </w:pPr>
+      <w:r>
+        <w:rPr>
+          <w:rFonts w:ascii="맑은 고딕" w:cs="맑은 고딕" w:eastAsia="맑은 고딕" w:hAnsi="맑은 고딕"/>
+          <w:b/>
+          <w:bCs/>
+          <w:sz w:val="20"/>
+          <w:szCs w:val="20"/>
+        </w:rPr>
+        <w:t xml:space="preserve">설치·설정</w:t>
+      </w:r>
+    </w:p>
+    <w:p>
+      <w:pPr>
+        <w:pStyle w:val="ListParagraph"/>
+        <w:numPr>
+          <w:ilvl w:val="0"/>
+          <w:numId w:val="2"/>
+        </w:numPr>
+        <w:spacing w:after="40" w:before="0" w:line="270"/>
+      </w:pPr>
+      <w:r>
+        <w:rPr>
+          <w:rFonts w:ascii="맑은 고딕" w:cs="맑은 고딕" w:eastAsia="맑은 고딕" w:hAnsi="맑은 고딕"/>
+          <w:b/>
+          <w:bCs/>
+          <w:sz w:val="19"/>
+          <w:szCs w:val="19"/>
+        </w:rPr>
+        <w:t xml:space="preserve">위치: </w:t>
+      </w:r>
+      <w:r>
+        <w:rPr>
+          <w:rFonts w:ascii="맑은 고딕" w:cs="맑은 고딕" w:eastAsia="맑은 고딕" w:hAnsi="맑은 고딕"/>
+          <w:sz w:val="19"/>
+          <w:szCs w:val="19"/>
+        </w:rPr>
+        <w:t xml:space="preserve">객석 가운데 뒤쪽, 영상 믹서 바로 옆. 삼각대는 1.8m 이상 올리고, 통로를 막지 않게 다리를 테이프로 고정</w:t>
+      </w:r>
+    </w:p>
+    <w:p>
+      <w:pPr>
+        <w:pStyle w:val="ListParagraph"/>
+        <w:numPr>
+          <w:ilvl w:val="0"/>
+          <w:numId w:val="2"/>
+        </w:numPr>
+        <w:spacing w:after="40" w:before="0" w:line="270"/>
+      </w:pPr>
+      <w:r>
+        <w:rPr>
+          <w:rFonts w:ascii="맑은 고딕" w:cs="맑은 고딕" w:eastAsia="맑은 고딕" w:hAnsi="맑은 고딕"/>
+          <w:b/>
+          <w:bCs/>
+          <w:sz w:val="19"/>
+          <w:szCs w:val="19"/>
+        </w:rPr>
+        <w:t xml:space="preserve">해상도·프레임 통일: </w:t>
+      </w:r>
+      <w:r>
+        <w:rPr>
+          <w:rFonts w:ascii="맑은 고딕" w:cs="맑은 고딕" w:eastAsia="맑은 고딕" w:hAnsi="맑은 고딕"/>
+          <w:sz w:val="19"/>
+          <w:szCs w:val="19"/>
+        </w:rPr>
+        <w:t xml:space="preserve">카메라·노트북·믹서 모두 1080p 59.94(또는 60), 노트북은 1920×1080 · 60Hz. 다르면 화면이 안 나오거나 깜빡임</w:t>
+      </w:r>
+    </w:p>
+    <w:p>
+      <w:pPr>
+        <w:pStyle w:val="ListParagraph"/>
+        <w:numPr>
+          <w:ilvl w:val="0"/>
+          <w:numId w:val="2"/>
+        </w:numPr>
+        <w:spacing w:after="40" w:before="0" w:line="270"/>
+      </w:pPr>
+      <w:r>
+        <w:rPr>
+          <w:rFonts w:ascii="맑은 고딕" w:cs="맑은 고딕" w:eastAsia="맑은 고딕" w:hAnsi="맑은 고딕"/>
+          <w:b/>
+          <w:bCs/>
+          <w:sz w:val="19"/>
+          <w:szCs w:val="19"/>
+        </w:rPr>
+        <w:t xml:space="preserve">HDMI 출력 화면 표시(OSD) 끄기: </w:t>
+      </w:r>
+      <w:r>
+        <w:rPr>
+          <w:rFonts w:ascii="맑은 고딕" w:cs="맑은 고딕" w:eastAsia="맑은 고딕" w:hAnsi="맑은 고딕"/>
+          <w:sz w:val="19"/>
+          <w:szCs w:val="19"/>
+        </w:rPr>
+        <w:t xml:space="preserve">안 끄면 배터리·시간 표시가 스크린에 그대로 나감. 자동 꺼짐·절전·데모 모드도 끄기</w:t>
+      </w:r>
+    </w:p>
+    <w:p>
+      <w:pPr>
+        <w:pStyle w:val="ListParagraph"/>
+        <w:numPr>
+          <w:ilvl w:val="0"/>
+          <w:numId w:val="2"/>
+        </w:numPr>
+        <w:spacing w:after="40" w:before="0" w:line="270"/>
+      </w:pPr>
+      <w:r>
+        <w:rPr>
+          <w:rFonts w:ascii="맑은 고딕" w:cs="맑은 고딕" w:eastAsia="맑은 고딕" w:hAnsi="맑은 고딕"/>
+          <w:b/>
+          <w:bCs/>
+          <w:sz w:val="19"/>
+          <w:szCs w:val="19"/>
+        </w:rPr>
+        <w:t xml:space="preserve">화이트밸런스·노출 수동 고정: </w:t>
+      </w:r>
+      <w:r>
+        <w:rPr>
+          <w:rFonts w:ascii="맑은 고딕" w:cs="맑은 고딕" w:eastAsia="맑은 고딕" w:hAnsi="맑은 고딕"/>
+          <w:sz w:val="19"/>
+          <w:szCs w:val="19"/>
+        </w:rPr>
+        <w:t xml:space="preserve">무대 조명을 켠 상태에서 맞추고, 얼굴이 하얗게 날지 않게 노출은 약간 낮게. 초점은 강대상에 맞춰 고정</w:t>
+      </w:r>
+    </w:p>
+    <w:p>
+      <w:pPr>
+        <w:pStyle w:val="ListParagraph"/>
+        <w:numPr>
+          <w:ilvl w:val="0"/>
+          <w:numId w:val="2"/>
+        </w:numPr>
+        <w:spacing w:after="40" w:before="0" w:line="270"/>
+      </w:pPr>
+      <w:r>
+        <w:rPr>
+          <w:rFonts w:ascii="맑은 고딕" w:cs="맑은 고딕" w:eastAsia="맑은 고딕" w:hAnsi="맑은 고딕"/>
+          <w:b/>
+          <w:bCs/>
+          <w:sz w:val="19"/>
+          <w:szCs w:val="19"/>
+        </w:rPr>
+        <w:t xml:space="preserve">자막기: </w:t>
+      </w:r>
+      <w:r>
+        <w:rPr>
+          <w:rFonts w:ascii="맑은 고딕" w:cs="맑은 고딕" w:eastAsia="맑은 고딕" w:hAnsi="맑은 고딕"/>
+          <w:sz w:val="19"/>
+          <w:szCs w:val="19"/>
+        </w:rPr>
+        <w:t xml:space="preserve">HDMI 입력·출력형은 믹서 출력 뒤에, PC형은 믹서 입력 4번에 넣고 키(루마·크로마) 기능으로 합성</w:t>
+      </w:r>
+    </w:p>
+    <w:p>
+      <w:pPr>
+        <w:spacing w:after="50" w:before="0" w:line="260"/>
+      </w:pPr>
+      <w:r>
+        <w:rPr>
+          <w:rFonts w:ascii="맑은 고딕" w:cs="맑은 고딕" w:eastAsia="맑은 고딕" w:hAnsi="맑은 고딕"/>
+          <w:b/>
+          <w:bCs/>
+          <w:sz w:val="20"/>
+          <w:szCs w:val="20"/>
+        </w:rPr>
+        <w:t xml:space="preserve">리허설 때 확인</w:t>
+      </w:r>
+    </w:p>
+    <w:p>
+      <w:pPr>
+        <w:pStyle w:val="ListParagraph"/>
+        <w:numPr>
+          <w:ilvl w:val="0"/>
+          <w:numId w:val="2"/>
+        </w:numPr>
+        <w:spacing w:after="40" w:before="0" w:line="270"/>
+      </w:pPr>
+      <w:r>
+        <w:rPr>
+          <w:rFonts w:ascii="맑은 고딕" w:cs="맑은 고딕" w:eastAsia="맑은 고딕" w:hAnsi="맑은 고딕"/>
+          <w:sz w:val="19"/>
+          <w:szCs w:val="19"/>
+        </w:rPr>
+        <w:t xml:space="preserve">카메라에 </w:t>
+      </w:r>
+      <w:r>
+        <w:rPr>
+          <w:rFonts w:ascii="맑은 고딕" w:cs="맑은 고딕" w:eastAsia="맑은 고딕" w:hAnsi="맑은 고딕"/>
+          <w:b/>
+          <w:bCs/>
+          <w:sz w:val="19"/>
+          <w:szCs w:val="19"/>
+        </w:rPr>
+        <w:t xml:space="preserve">스크린이 잡히면</w:t>
+      </w:r>
+      <w:r>
+        <w:rPr>
+          <w:rFonts w:ascii="맑은 고딕" w:cs="맑은 고딕" w:eastAsia="맑은 고딕" w:hAnsi="맑은 고딕"/>
+          <w:sz w:val="19"/>
+          <w:szCs w:val="19"/>
+        </w:rPr>
+        <w:t xml:space="preserve"> 화면 속 화면이 끝없이 반복됨 → 강대상 쪽으로 당겨서 스크린이 안 들어오게</w:t>
+      </w:r>
+    </w:p>
+    <w:p>
+      <w:pPr>
+        <w:pStyle w:val="ListParagraph"/>
+        <w:numPr>
+          <w:ilvl w:val="0"/>
+          <w:numId w:val="2"/>
+        </w:numPr>
+        <w:spacing w:after="40" w:before="0" w:line="270"/>
+      </w:pPr>
+      <w:r>
+        <w:rPr>
+          <w:rFonts w:ascii="맑은 고딕" w:cs="맑은 고딕" w:eastAsia="맑은 고딕" w:hAnsi="맑은 고딕"/>
+          <w:sz w:val="19"/>
+          <w:szCs w:val="19"/>
+        </w:rPr>
+        <w:t xml:space="preserve">자막은 강사 얼굴을 가리지 않게 </w:t>
+      </w:r>
+      <w:r>
+        <w:rPr>
+          <w:rFonts w:ascii="맑은 고딕" w:cs="맑은 고딕" w:eastAsia="맑은 고딕" w:hAnsi="맑은 고딕"/>
+          <w:b/>
+          <w:bCs/>
+          <w:sz w:val="19"/>
+          <w:szCs w:val="19"/>
+        </w:rPr>
+        <w:t xml:space="preserve">화면 아래쪽 1/3</w:t>
+      </w:r>
+      <w:r>
+        <w:rPr>
+          <w:rFonts w:ascii="맑은 고딕" w:cs="맑은 고딕" w:eastAsia="맑은 고딕" w:hAnsi="맑은 고딕"/>
+          <w:sz w:val="19"/>
+          <w:szCs w:val="19"/>
+        </w:rPr>
+        <w:t xml:space="preserve">에</w:t>
+      </w:r>
+    </w:p>
+    <w:p>
+      <w:pPr>
+        <w:pStyle w:val="ListParagraph"/>
+        <w:numPr>
+          <w:ilvl w:val="0"/>
+          <w:numId w:val="2"/>
+        </w:numPr>
+        <w:spacing w:after="40" w:before="0" w:line="270"/>
+      </w:pPr>
+      <w:r>
+        <w:rPr>
+          <w:rFonts w:ascii="맑은 고딕" w:cs="맑은 고딕" w:eastAsia="맑은 고딕" w:hAnsi="맑은 고딕"/>
+          <w:sz w:val="19"/>
+          <w:szCs w:val="19"/>
+        </w:rPr>
+        <w:t xml:space="preserve">화면이 소리보다 0.1초 정도 늦을 수 있음 → 빔프로젝터에 저지연(게임) 모드가 있으면 켜기</w:t>
+      </w:r>
+    </w:p>
+    <w:p>
+      <w:pPr>
+        <w:pStyle w:val="ListParagraph"/>
+        <w:numPr>
+          <w:ilvl w:val="0"/>
+          <w:numId w:val="2"/>
+        </w:numPr>
+        <w:spacing w:after="40" w:before="0" w:line="270"/>
+      </w:pPr>
+      <w:r>
+        <w:rPr>
+          <w:rFonts w:ascii="맑은 고딕" w:cs="맑은 고딕" w:eastAsia="맑은 고딕" w:hAnsi="맑은 고딕"/>
+          <w:sz w:val="19"/>
+          <w:szCs w:val="19"/>
+        </w:rPr>
+        <w:t xml:space="preserve">강대상 TV에 강사 본인 얼굴이 불편하면 믹서 보조 출력(AUX)이나 자막 화면만 따로 보내기</w:t>
+      </w:r>
+    </w:p>
+    <w:p>
+      <w:pPr>
+        <w:pStyle w:val="ListParagraph"/>
+        <w:numPr>
+          <w:ilvl w:val="0"/>
+          <w:numId w:val="2"/>
+        </w:numPr>
+        <w:spacing w:after="40" w:before="0" w:line="270"/>
+      </w:pPr>
+      <w:r>
+        <w:rPr>
+          <w:rFonts w:ascii="맑은 고딕" w:cs="맑은 고딕" w:eastAsia="맑은 고딕" w:hAnsi="맑은 고딕"/>
+          <w:b/>
+          <w:bCs/>
+          <w:sz w:val="19"/>
+          <w:szCs w:val="19"/>
+        </w:rPr>
+        <w:t xml:space="preserve">카메라 담당 1명</w:t>
+      </w:r>
+      <w:r>
+        <w:rPr>
+          <w:rFonts w:ascii="맑은 고딕" w:cs="맑은 고딕" w:eastAsia="맑은 고딕" w:hAnsi="맑은 고딕"/>
+          <w:sz w:val="19"/>
+          <w:szCs w:val="19"/>
+        </w:rPr>
+        <w:t xml:space="preserve"> 따로 두고(줌·구도), 믹서 담당과 신호 방법 미리 정하기</w:t>
+      </w:r>
+    </w:p>
+    <w:p>
+      <w:pPr>
+        <w:pBdr>
+          <w:bottom w:val="single" w:color="2E75B6" w:sz="8" w:space="2"/>
+        </w:pBdr>
+        <w:spacing w:after="90" w:before="200"/>
+      </w:pPr>
+      <w:r>
+        <w:rPr>
+          <w:rFonts w:ascii="맑은 고딕" w:cs="맑은 고딕" w:eastAsia="맑은 고딕" w:hAnsi="맑은 고딕"/>
+          <w:b/>
+          <w:bCs/>
+          <w:sz w:val="25"/>
+          <w:szCs w:val="25"/>
+        </w:rPr>
+        <w:t xml:space="preserve">5. 세팅 전 벡스코 담당자에게 확인할 것</w:t>
       </w:r>
     </w:p>
     <w:p>
@@ -5493,7 +7100,20 @@
           <w:sz w:val="19"/>
           <w:szCs w:val="19"/>
         </w:rPr>
-        <w:t xml:space="preserve">☐  조정석(우리 콘솔 자리) 위치와 무대까지 실제 거리</w:t>
+        <w:t xml:space="preserve">☐  조정석(우리 콘솔·영상 믹서 자리) 위치와 무대까지 실제 거리</w:t>
+      </w:r>
+    </w:p>
+    <w:p>
+      <w:pPr>
+        <w:spacing w:after="40" w:before="0" w:line="260"/>
+      </w:pPr>
+      <w:r>
+        <w:rPr>
+          <w:rFonts w:ascii="맑은 고딕" w:cs="맑은 고딕" w:eastAsia="맑은 고딕" w:hAnsi="맑은 고딕"/>
+          <w:sz w:val="19"/>
+          <w:szCs w:val="19"/>
+        </w:rPr>
+        <w:t xml:space="preserve">☐  객석 가운데 통로에 카메라 삼각대를 세워도 되는지</w:t>
       </w:r>
     </w:p>
     <w:p>

</xml_diff>